<commit_message>
updated spring rest doc
</commit_message>
<xml_diff>
--- a/V-IMP-Notes-TechLearning/SpringBoot/SpringRest.docx
+++ b/V-IMP-Notes-TechLearning/SpringBoot/SpringRest.docx
@@ -55,6 +55,7 @@
       <w:r>
         <w:rPr>
           <w:rStyle w:val="Hyperlink"/>
+          <w:noProof/>
         </w:rPr>
         <w:drawing>
           <wp:inline distT="0" distB="0" distL="0" distR="0" wp14:anchorId="751CCA38" wp14:editId="60148169">
@@ -178,23 +179,7 @@
     </w:p>
     <w:p>
       <w:r>
-        <w:t xml:space="preserve">In this blog post we will discuss about API </w:t>
-      </w:r>
-      <w:proofErr w:type="gramStart"/>
-      <w:r>
-        <w:t>Versioning ,</w:t>
-      </w:r>
-      <w:proofErr w:type="gramEnd"/>
-      <w:r>
-        <w:t xml:space="preserve"> </w:t>
-      </w:r>
-      <w:proofErr w:type="gramStart"/>
-      <w:r>
-        <w:t>what ,</w:t>
-      </w:r>
-      <w:proofErr w:type="gramEnd"/>
-      <w:r>
-        <w:t xml:space="preserve"> why and how will we implement same with our spring boot application.</w:t>
+        <w:t>In this blog post we will discuss about API Versioning , what , why and how will we implement same with our spring boot application.</w:t>
       </w:r>
     </w:p>
     <w:p>
@@ -211,8 +196,15 @@
         <w:t>Press enter or click to view image in full size</w:t>
       </w:r>
     </w:p>
-    <w:p>
-      <w:r>
+    <w:p/>
+    <w:p/>
+    <w:p/>
+    <w:p/>
+    <w:p>
+      <w:r>
+        <w:rPr>
+          <w:noProof/>
+        </w:rPr>
         <w:lastRenderedPageBreak/>
         <w:drawing>
           <wp:inline distT="0" distB="0" distL="0" distR="0" wp14:anchorId="6C86B5C2" wp14:editId="2DC7A3DE">
@@ -273,104 +265,30 @@
           <w:b/>
           <w:bCs/>
         </w:rPr>
-        <w:t xml:space="preserve">hat and </w:t>
-      </w:r>
-      <w:proofErr w:type="gramStart"/>
-      <w:r>
-        <w:rPr>
-          <w:b/>
-          <w:bCs/>
-        </w:rPr>
-        <w:t>Why ?</w:t>
-      </w:r>
-      <w:proofErr w:type="gramEnd"/>
-      <w:r>
-        <w:rPr>
-          <w:b/>
-          <w:bCs/>
-        </w:rPr>
-        <w:t xml:space="preserve"> Rest-API Versioning</w:t>
-      </w:r>
-    </w:p>
-    <w:p>
-      <w:r>
-        <w:t xml:space="preserve">API versioning is a way to allow </w:t>
-      </w:r>
-      <w:proofErr w:type="spellStart"/>
-      <w:proofErr w:type="gramStart"/>
-      <w:r>
-        <w:t>consumer’s</w:t>
-      </w:r>
-      <w:proofErr w:type="spellEnd"/>
-      <w:proofErr w:type="gramEnd"/>
-      <w:r>
-        <w:t xml:space="preserve"> of </w:t>
-      </w:r>
-      <w:proofErr w:type="gramStart"/>
-      <w:r>
-        <w:t>API’s</w:t>
-      </w:r>
-      <w:proofErr w:type="gramEnd"/>
-      <w:r>
-        <w:t xml:space="preserve"> to use existing API or migrate to the new version of API’s once that will be ready.</w:t>
-      </w:r>
-    </w:p>
-    <w:p>
-      <w:proofErr w:type="gramStart"/>
-      <w:r>
-        <w:t>Example :</w:t>
-      </w:r>
-      <w:proofErr w:type="gramEnd"/>
-      <w:r>
-        <w:t xml:space="preserve"> Let suppose we have a rest API name </w:t>
-      </w:r>
-      <w:r>
-        <w:rPr>
-          <w:b/>
-          <w:bCs/>
-        </w:rPr>
-        <w:t>/</w:t>
-      </w:r>
-      <w:proofErr w:type="spellStart"/>
-      <w:r>
-        <w:rPr>
-          <w:b/>
-          <w:bCs/>
-        </w:rPr>
-        <w:t>personalDetailsVerfication</w:t>
-      </w:r>
-      <w:proofErr w:type="spellEnd"/>
-    </w:p>
-    <w:p>
-      <w:proofErr w:type="gramStart"/>
-      <w:r>
-        <w:t>So</w:t>
-      </w:r>
-      <w:proofErr w:type="gramEnd"/>
-      <w:r>
-        <w:t xml:space="preserve"> there can be a case in first version of API we are validating information on the basis of ID-Document-1 and may be later we have updated our API like other documents also getting accepted for </w:t>
-      </w:r>
-      <w:proofErr w:type="gramStart"/>
-      <w:r>
-        <w:t>verifications .</w:t>
-      </w:r>
-      <w:proofErr w:type="gramEnd"/>
-      <w:r>
-        <w:t xml:space="preserve"> </w:t>
-      </w:r>
-      <w:proofErr w:type="gramStart"/>
-      <w:r>
-        <w:t>so</w:t>
-      </w:r>
-      <w:proofErr w:type="gramEnd"/>
-      <w:r>
-        <w:t xml:space="preserve"> in such cases we will implement versioning of API concept where current and new both will work </w:t>
-      </w:r>
-      <w:proofErr w:type="gramStart"/>
-      <w:r>
-        <w:t>parallelly .</w:t>
-      </w:r>
-      <w:proofErr w:type="gramEnd"/>
+        <w:t>hat and Why ? Rest-API Versioning</w:t>
+      </w:r>
+    </w:p>
+    <w:p>
+      <w:r>
+        <w:t>API versioning is a way to allow consumer’s of API’s to use existing API or migrate to the new version of API’s once that will be ready.</w:t>
+      </w:r>
+    </w:p>
+    <w:p>
+      <w:r>
+        <w:t>Example : Let suppose we have a rest API name </w:t>
+      </w:r>
+      <w:r>
+        <w:rPr>
+          <w:b/>
+          <w:bCs/>
+        </w:rPr>
+        <w:t>/personalDetailsVerfication</w:t>
+      </w:r>
+    </w:p>
+    <w:p>
+      <w:r>
+        <w:t>So there can be a case in first version of API we are validating information on the basis of ID-Document-1 and may be later we have updated our API like other documents also getting accepted for verifications . so in such cases we will implement versioning of API concept where current and new both will work parallelly .</w:t>
+      </w:r>
     </w:p>
     <w:p>
       <w:pPr>
@@ -392,6 +310,9 @@
     </w:p>
     <w:p>
       <w:r>
+        <w:rPr>
+          <w:noProof/>
+        </w:rPr>
         <w:lastRenderedPageBreak/>
         <w:drawing>
           <wp:inline distT="0" distB="0" distL="0" distR="0" wp14:anchorId="06F7D794" wp14:editId="1F321CA0">
@@ -460,15 +381,7 @@
     </w:p>
     <w:p>
       <w:r>
-        <w:t xml:space="preserve">In Spring </w:t>
-      </w:r>
-      <w:proofErr w:type="gramStart"/>
-      <w:r>
-        <w:t>boot</w:t>
-      </w:r>
-      <w:proofErr w:type="gramEnd"/>
-      <w:r>
-        <w:t xml:space="preserve"> we can implement REST-API versioning in 4 ways</w:t>
+        <w:t>In Spring boot we can implement REST-API versioning in 4 ways</w:t>
       </w:r>
     </w:p>
     <w:p>
@@ -478,7 +391,6 @@
           <w:iCs/>
         </w:rPr>
       </w:pPr>
-      <w:proofErr w:type="spellStart"/>
       <w:r>
         <w:rPr>
           <w:b/>
@@ -486,149 +398,104 @@
           <w:i/>
           <w:iCs/>
         </w:rPr>
-        <w:t>i</w:t>
-      </w:r>
-      <w:proofErr w:type="spellEnd"/>
-      <w:r>
-        <w:rPr>
-          <w:b/>
-          <w:bCs/>
+        <w:t>i)</w:t>
+      </w:r>
+      <w:r>
+        <w:rPr>
           <w:i/>
           <w:iCs/>
         </w:rPr>
-        <w:t>)</w:t>
-      </w:r>
-      <w:r>
+        <w:t>URI Path Versioning</w:t>
+      </w:r>
+    </w:p>
+    <w:p>
+      <w:pPr>
         <w:rPr>
           <w:i/>
           <w:iCs/>
         </w:rPr>
-        <w:t>URI Path Versioning</w:t>
-      </w:r>
-    </w:p>
-    <w:p>
-      <w:pPr>
-        <w:rPr>
+      </w:pPr>
+      <w:r>
+        <w:rPr>
+          <w:b/>
+          <w:bCs/>
           <w:i/>
           <w:iCs/>
         </w:rPr>
-      </w:pPr>
-      <w:r>
-        <w:rPr>
-          <w:b/>
-          <w:bCs/>
+        <w:t>ii)</w:t>
+      </w:r>
+      <w:r>
+        <w:rPr>
           <w:i/>
           <w:iCs/>
         </w:rPr>
-        <w:t>ii)</w:t>
-      </w:r>
-      <w:r>
+        <w:t>Custom Header Versioning</w:t>
+      </w:r>
+    </w:p>
+    <w:p>
+      <w:pPr>
         <w:rPr>
           <w:i/>
           <w:iCs/>
         </w:rPr>
-        <w:t>Custom Header Versioning</w:t>
-      </w:r>
-    </w:p>
-    <w:p>
-      <w:pPr>
-        <w:rPr>
+      </w:pPr>
+      <w:r>
+        <w:rPr>
+          <w:b/>
+          <w:bCs/>
           <w:i/>
           <w:iCs/>
         </w:rPr>
-      </w:pPr>
-      <w:r>
-        <w:rPr>
-          <w:b/>
-          <w:bCs/>
+        <w:t>iii)</w:t>
+      </w:r>
+      <w:r>
+        <w:rPr>
           <w:i/>
           <w:iCs/>
         </w:rPr>
-        <w:t>iii)</w:t>
-      </w:r>
-      <w:r>
+        <w:t>Content Negotiation Versioning</w:t>
+      </w:r>
+    </w:p>
+    <w:p>
+      <w:pPr>
         <w:rPr>
           <w:i/>
           <w:iCs/>
         </w:rPr>
-        <w:t>Content Negotiation Versioning</w:t>
-      </w:r>
-    </w:p>
-    <w:p>
-      <w:pPr>
-        <w:rPr>
+      </w:pPr>
+      <w:r>
+        <w:rPr>
+          <w:b/>
+          <w:bCs/>
           <w:i/>
           <w:iCs/>
         </w:rPr>
-      </w:pPr>
-      <w:r>
-        <w:rPr>
-          <w:b/>
-          <w:bCs/>
+        <w:t>iv)</w:t>
+      </w:r>
+      <w:r>
+        <w:rPr>
           <w:i/>
           <w:iCs/>
         </w:rPr>
-        <w:t>iv)</w:t>
-      </w:r>
-      <w:r>
-        <w:rPr>
-          <w:i/>
-          <w:iCs/>
-        </w:rPr>
         <w:t>Query Parameter Change Versioning</w:t>
       </w:r>
     </w:p>
     <w:p>
-      <w:proofErr w:type="spellStart"/>
-      <w:r>
-        <w:rPr>
-          <w:b/>
-          <w:bCs/>
-        </w:rPr>
-        <w:t>i</w:t>
-      </w:r>
-      <w:proofErr w:type="spellEnd"/>
-      <w:r>
-        <w:rPr>
-          <w:b/>
-          <w:bCs/>
-        </w:rPr>
-        <w:t xml:space="preserve">)URI Path </w:t>
-      </w:r>
-      <w:proofErr w:type="gramStart"/>
-      <w:r>
-        <w:rPr>
-          <w:b/>
-          <w:bCs/>
-        </w:rPr>
-        <w:t>versioning :</w:t>
-      </w:r>
-      <w:proofErr w:type="gramEnd"/>
-      <w:r>
-        <w:rPr>
-          <w:b/>
-          <w:bCs/>
-        </w:rPr>
-        <w:t>- </w:t>
-      </w:r>
-      <w:r>
-        <w:t xml:space="preserve">URI path versioning is a </w:t>
-      </w:r>
-      <w:proofErr w:type="gramStart"/>
-      <w:r>
-        <w:t>way ,</w:t>
-      </w:r>
-      <w:proofErr w:type="gramEnd"/>
-      <w:r>
-        <w:t xml:space="preserve"> where you are changing in URL of expose rest endpoint for different-different versions.</w:t>
-      </w:r>
-    </w:p>
-    <w:p>
-      <w:proofErr w:type="gramStart"/>
+      <w:r>
+        <w:rPr>
+          <w:b/>
+          <w:bCs/>
+        </w:rPr>
+        <w:t>i)URI Path versioning :- </w:t>
+      </w:r>
+      <w:r>
+        <w:t>URI path versioning is a way , where you are changing in URL of expose rest endpoint for different-different versions.</w:t>
+      </w:r>
+    </w:p>
+    <w:p>
       <w:r>
         <w:t>Example :</w:t>
       </w:r>
-      <w:proofErr w:type="gramEnd"/>
     </w:p>
     <w:p>
       <w:hyperlink r:id="rId11" w:tgtFrame="_blank" w:history="1">
@@ -661,81 +528,33 @@
     </w:p>
     <w:p>
       <w:r>
-        <w:t xml:space="preserve">package </w:t>
-      </w:r>
-      <w:proofErr w:type="spellStart"/>
-      <w:r>
-        <w:t>com.api.verioning.ApiVersioning.controller</w:t>
-      </w:r>
-      <w:proofErr w:type="spellEnd"/>
-      <w:r>
-        <w:t>;</w:t>
-      </w:r>
-      <w:r>
-        <w:br/>
-      </w:r>
-      <w:r>
-        <w:br/>
-        <w:t xml:space="preserve">import </w:t>
-      </w:r>
-      <w:proofErr w:type="spellStart"/>
-      <w:r>
-        <w:t>java.util.ArrayList</w:t>
-      </w:r>
-      <w:proofErr w:type="spellEnd"/>
-      <w:r>
-        <w:t>;</w:t>
-      </w:r>
-      <w:r>
-        <w:br/>
-        <w:t xml:space="preserve">import </w:t>
-      </w:r>
-      <w:proofErr w:type="spellStart"/>
-      <w:r>
-        <w:t>java.util.List</w:t>
-      </w:r>
-      <w:proofErr w:type="spellEnd"/>
-      <w:r>
-        <w:t>;</w:t>
-      </w:r>
-      <w:r>
-        <w:br/>
-      </w:r>
-      <w:r>
-        <w:br/>
-        <w:t xml:space="preserve">import </w:t>
-      </w:r>
-      <w:proofErr w:type="spellStart"/>
-      <w:r>
-        <w:t>org.springframework.web.bind.annotation.GetMapping</w:t>
-      </w:r>
-      <w:proofErr w:type="spellEnd"/>
-      <w:r>
-        <w:t>;</w:t>
-      </w:r>
-      <w:r>
-        <w:br/>
-        <w:t xml:space="preserve">import </w:t>
-      </w:r>
-      <w:proofErr w:type="spellStart"/>
-      <w:r>
-        <w:t>org.springframework.web.bind.annotation.RequestMapping</w:t>
-      </w:r>
-      <w:proofErr w:type="spellEnd"/>
-      <w:r>
-        <w:t>;</w:t>
-      </w:r>
-      <w:r>
-        <w:br/>
-        <w:t xml:space="preserve">import </w:t>
-      </w:r>
-      <w:proofErr w:type="spellStart"/>
-      <w:r>
-        <w:t>org.springframework.web.bind.annotation.RestController</w:t>
-      </w:r>
-      <w:proofErr w:type="spellEnd"/>
-      <w:r>
-        <w:t>;</w:t>
+        <w:t>package com.api.verioning.ApiVersioning.controller;</w:t>
+      </w:r>
+      <w:r>
+        <w:br/>
+      </w:r>
+      <w:r>
+        <w:br/>
+        <w:t>import java.util.ArrayList;</w:t>
+      </w:r>
+      <w:r>
+        <w:br/>
+        <w:t>import java.util.List;</w:t>
+      </w:r>
+      <w:r>
+        <w:br/>
+      </w:r>
+      <w:r>
+        <w:br/>
+        <w:t>import org.springframework.web.bind.annotation.GetMapping;</w:t>
+      </w:r>
+      <w:r>
+        <w:br/>
+        <w:t>import org.springframework.web.bind.annotation.RequestMapping;</w:t>
+      </w:r>
+      <w:r>
+        <w:br/>
+        <w:t>import org.springframework.web.bind.annotation.RestController;</w:t>
       </w:r>
       <w:r>
         <w:br/>
@@ -778,15 +597,7 @@
       </w:r>
       <w:r>
         <w:br/>
-        <w:t xml:space="preserve"> * As this is a dummy example to understand the concept so in your actual scenarios you can call you service </w:t>
-      </w:r>
-      <w:proofErr w:type="spellStart"/>
-      <w:r>
-        <w:t>db</w:t>
-      </w:r>
-      <w:proofErr w:type="spellEnd"/>
-      <w:r>
-        <w:t xml:space="preserve"> layer also and fetch result for API's accordingly</w:t>
+        <w:t xml:space="preserve"> * As this is a dummy example to understand the concept so in your actual scenarios you can call you service db layer also and fetch result for API's accordingly</w:t>
       </w:r>
       <w:r>
         <w:br/>
@@ -806,15 +617,7 @@
       </w:r>
       <w:r>
         <w:br/>
-        <w:t xml:space="preserve">public class </w:t>
-      </w:r>
-      <w:proofErr w:type="spellStart"/>
-      <w:r>
-        <w:t>URIPathVersionController</w:t>
-      </w:r>
-      <w:proofErr w:type="spellEnd"/>
-      <w:r>
-        <w:t xml:space="preserve"> {</w:t>
+        <w:t>public class URIPathVersionController {</w:t>
       </w:r>
       <w:r>
         <w:br/>
@@ -833,43 +636,11 @@
       </w:r>
       <w:r>
         <w:br/>
-        <w:t xml:space="preserve">     </w:t>
-      </w:r>
-      <w:proofErr w:type="spellStart"/>
-      <w:r>
-        <w:t>ArrayList</w:t>
-      </w:r>
-      <w:proofErr w:type="spellEnd"/>
-      <w:r>
-        <w:t xml:space="preserve">&lt;ApplicantRsponseVersion1&gt; applicant = new </w:t>
-      </w:r>
-      <w:proofErr w:type="spellStart"/>
-      <w:r>
-        <w:t>ArrayList</w:t>
-      </w:r>
-      <w:proofErr w:type="spellEnd"/>
-      <w:r>
-        <w:t>&lt;&gt;();</w:t>
-      </w:r>
-      <w:r>
-        <w:br/>
-        <w:t xml:space="preserve">     </w:t>
-      </w:r>
-      <w:proofErr w:type="spellStart"/>
-      <w:r>
-        <w:t>applicant.add</w:t>
-      </w:r>
-      <w:proofErr w:type="spellEnd"/>
-      <w:r>
-        <w:t>(new ApplicantRsponseVersion1("</w:t>
-      </w:r>
-      <w:proofErr w:type="spellStart"/>
-      <w:r>
-        <w:t>vivek</w:t>
-      </w:r>
-      <w:proofErr w:type="spellEnd"/>
-      <w:r>
-        <w:t>", "31"));</w:t>
+        <w:t xml:space="preserve">     ArrayList&lt;ApplicantRsponseVersion1&gt; applicant = new ArrayList&lt;&gt;();</w:t>
+      </w:r>
+      <w:r>
+        <w:br/>
+        <w:t xml:space="preserve">     applicant.add(new ApplicantRsponseVersion1("vivek", "31"));</w:t>
       </w:r>
       <w:r>
         <w:br/>
@@ -897,35 +668,11 @@
       </w:r>
       <w:r>
         <w:br/>
-        <w:t xml:space="preserve">     </w:t>
-      </w:r>
-      <w:proofErr w:type="spellStart"/>
-      <w:r>
-        <w:t>ArrayList</w:t>
-      </w:r>
-      <w:proofErr w:type="spellEnd"/>
-      <w:r>
-        <w:t xml:space="preserve">&lt;ApplicantRsponseVersion2&gt; applicant = new </w:t>
-      </w:r>
-      <w:proofErr w:type="spellStart"/>
-      <w:r>
-        <w:t>ArrayList</w:t>
-      </w:r>
-      <w:proofErr w:type="spellEnd"/>
-      <w:r>
-        <w:t>&lt;&gt;();</w:t>
-      </w:r>
-      <w:r>
-        <w:br/>
-        <w:t xml:space="preserve">     </w:t>
-      </w:r>
-      <w:proofErr w:type="spellStart"/>
-      <w:r>
-        <w:t>applicant.add</w:t>
-      </w:r>
-      <w:proofErr w:type="spellEnd"/>
-      <w:r>
-        <w:t>(new ApplicantRsponseVersion2("ram", "34", "male"));</w:t>
+        <w:t xml:space="preserve">     ArrayList&lt;ApplicantRsponseVersion2&gt; applicant = new ArrayList&lt;&gt;();</w:t>
+      </w:r>
+      <w:r>
+        <w:br/>
+        <w:t xml:space="preserve">     applicant.add(new ApplicantRsponseVersion2("ram", "34", "male"));</w:t>
       </w:r>
       <w:r>
         <w:br/>
@@ -946,17 +693,8 @@
           <w:b/>
           <w:bCs/>
         </w:rPr>
-        <w:t xml:space="preserve">Postman request will be </w:t>
-      </w:r>
-      <w:proofErr w:type="gramStart"/>
-      <w:r>
-        <w:rPr>
-          <w:b/>
-          <w:bCs/>
-        </w:rPr>
-        <w:t>like :</w:t>
-      </w:r>
-      <w:proofErr w:type="gramEnd"/>
+        <w:t>Postman request will be like :</w:t>
+      </w:r>
     </w:p>
     <w:p>
       <w:r>
@@ -964,6 +702,9 @@
         <w:t>Press enter or click to view image in full size</w:t>
       </w:r>
       <w:r>
+        <w:rPr>
+          <w:noProof/>
+        </w:rPr>
         <w:drawing>
           <wp:inline distT="0" distB="0" distL="0" distR="0" wp14:anchorId="6D16053B" wp14:editId="45760AD8">
             <wp:extent cx="4937760" cy="4030980"/>
@@ -1020,6 +761,9 @@
         <w:t>Press enter or click to view image in full size</w:t>
       </w:r>
       <w:r>
+        <w:rPr>
+          <w:noProof/>
+        </w:rPr>
         <w:drawing>
           <wp:inline distT="0" distB="0" distL="0" distR="0" wp14:anchorId="00D398AE" wp14:editId="1A992BFF">
             <wp:extent cx="4602480" cy="4305300"/>
@@ -1076,89 +820,31 @@
           <w:b/>
           <w:bCs/>
         </w:rPr>
-        <w:t xml:space="preserve">Version-1 and version-2 for both </w:t>
-      </w:r>
-      <w:proofErr w:type="gramStart"/>
-      <w:r>
-        <w:rPr>
-          <w:b/>
-          <w:bCs/>
-        </w:rPr>
-        <w:t>new ,</w:t>
-      </w:r>
-      <w:proofErr w:type="gramEnd"/>
-      <w:r>
-        <w:rPr>
-          <w:b/>
-          <w:bCs/>
-        </w:rPr>
-        <w:t xml:space="preserve"> old rest request</w:t>
-      </w:r>
-    </w:p>
-    <w:p>
-      <w:r>
-        <w:rPr>
-          <w:b/>
-          <w:bCs/>
-        </w:rPr>
-        <w:t xml:space="preserve">ii)Custom Header </w:t>
-      </w:r>
-      <w:proofErr w:type="gramStart"/>
-      <w:r>
-        <w:rPr>
-          <w:b/>
-          <w:bCs/>
-        </w:rPr>
-        <w:t>Versioning :</w:t>
-      </w:r>
-      <w:proofErr w:type="gramEnd"/>
-      <w:r>
-        <w:rPr>
-          <w:b/>
-          <w:bCs/>
-        </w:rPr>
-        <w:t> </w:t>
-      </w:r>
-      <w:r>
-        <w:t xml:space="preserve">Custom header approach </w:t>
-      </w:r>
-      <w:proofErr w:type="gramStart"/>
-      <w:r>
-        <w:t>use</w:t>
-      </w:r>
-      <w:proofErr w:type="gramEnd"/>
-      <w:r>
-        <w:t xml:space="preserve"> in that case when you are differentiating your API’s </w:t>
-      </w:r>
-      <w:proofErr w:type="gramStart"/>
-      <w:r>
-        <w:t>URL’s</w:t>
-      </w:r>
-      <w:proofErr w:type="gramEnd"/>
-      <w:r>
-        <w:t xml:space="preserve"> on the basis of header values (Key: value format).</w:t>
-      </w:r>
-    </w:p>
-    <w:p>
-      <w:proofErr w:type="gramStart"/>
-      <w:r>
-        <w:t>Example :headers</w:t>
-      </w:r>
-      <w:proofErr w:type="gramEnd"/>
-      <w:r>
-        <w:t>= {“x-</w:t>
-      </w:r>
-      <w:proofErr w:type="spellStart"/>
-      <w:r>
-        <w:t>api</w:t>
-      </w:r>
-      <w:proofErr w:type="spellEnd"/>
-      <w:r>
-        <w:t>-version=2”}</w:t>
-      </w:r>
-    </w:p>
-    <w:p>
-      <w:r>
+        <w:t>Version-1 and version-2 for both new , old rest request</w:t>
+      </w:r>
+    </w:p>
+    <w:p>
+      <w:r>
+        <w:rPr>
+          <w:b/>
+          <w:bCs/>
+        </w:rPr>
+        <w:t>ii)Custom Header Versioning : </w:t>
+      </w:r>
+      <w:r>
+        <w:t>Custom header approach use in that case when you are differentiating your API’s URL’s on the basis of header values (Key: value format).</w:t>
+      </w:r>
+    </w:p>
+    <w:p>
+      <w:r>
+        <w:t>Example :headers= {“x-api-version=2”}</w:t>
+      </w:r>
+    </w:p>
+    <w:p>
+      <w:r>
+        <w:rPr>
+          <w:noProof/>
+        </w:rPr>
         <mc:AlternateContent>
           <mc:Choice Requires="wps">
             <w:drawing>
@@ -1232,15 +918,7 @@
     </w:p>
     <w:p>
       <w:r>
-        <w:t>headers= {“x-</w:t>
-      </w:r>
-      <w:proofErr w:type="spellStart"/>
-      <w:r>
-        <w:t>api</w:t>
-      </w:r>
-      <w:proofErr w:type="spellEnd"/>
-      <w:r>
-        <w:t>-version=1”}</w:t>
+        <w:t>headers= {“x-api-version=1”}</w:t>
       </w:r>
     </w:p>
     <w:p>
@@ -1254,81 +932,33 @@
     </w:p>
     <w:p>
       <w:r>
-        <w:t xml:space="preserve">package </w:t>
-      </w:r>
-      <w:proofErr w:type="spellStart"/>
-      <w:r>
-        <w:t>com.api.verioning.ApiVersioning.controller</w:t>
-      </w:r>
-      <w:proofErr w:type="spellEnd"/>
-      <w:r>
-        <w:t>;</w:t>
-      </w:r>
-      <w:r>
-        <w:br/>
-      </w:r>
-      <w:r>
-        <w:br/>
-        <w:t xml:space="preserve">import </w:t>
-      </w:r>
-      <w:proofErr w:type="spellStart"/>
-      <w:r>
-        <w:t>java.util.ArrayList</w:t>
-      </w:r>
-      <w:proofErr w:type="spellEnd"/>
-      <w:r>
-        <w:t>;</w:t>
-      </w:r>
-      <w:r>
-        <w:br/>
-        <w:t xml:space="preserve">import </w:t>
-      </w:r>
-      <w:proofErr w:type="spellStart"/>
-      <w:r>
-        <w:t>java.util.List</w:t>
-      </w:r>
-      <w:proofErr w:type="spellEnd"/>
-      <w:r>
-        <w:t>;</w:t>
-      </w:r>
-      <w:r>
-        <w:br/>
-      </w:r>
-      <w:r>
-        <w:br/>
-        <w:t xml:space="preserve">import </w:t>
-      </w:r>
-      <w:proofErr w:type="spellStart"/>
-      <w:r>
-        <w:t>org.springframework.web.bind.annotation.GetMapping</w:t>
-      </w:r>
-      <w:proofErr w:type="spellEnd"/>
-      <w:r>
-        <w:t>;</w:t>
-      </w:r>
-      <w:r>
-        <w:br/>
-        <w:t xml:space="preserve">import </w:t>
-      </w:r>
-      <w:proofErr w:type="spellStart"/>
-      <w:r>
-        <w:t>org.springframework.web.bind.annotation.RequestMapping</w:t>
-      </w:r>
-      <w:proofErr w:type="spellEnd"/>
-      <w:r>
-        <w:t>;</w:t>
-      </w:r>
-      <w:r>
-        <w:br/>
-        <w:t xml:space="preserve">import </w:t>
-      </w:r>
-      <w:proofErr w:type="spellStart"/>
-      <w:r>
-        <w:t>org.springframework.web.bind.annotation.RestController</w:t>
-      </w:r>
-      <w:proofErr w:type="spellEnd"/>
-      <w:r>
-        <w:t>;</w:t>
+        <w:t>package com.api.verioning.ApiVersioning.controller;</w:t>
+      </w:r>
+      <w:r>
+        <w:br/>
+      </w:r>
+      <w:r>
+        <w:br/>
+        <w:t>import java.util.ArrayList;</w:t>
+      </w:r>
+      <w:r>
+        <w:br/>
+        <w:t>import java.util.List;</w:t>
+      </w:r>
+      <w:r>
+        <w:br/>
+      </w:r>
+      <w:r>
+        <w:br/>
+        <w:t>import org.springframework.web.bind.annotation.GetMapping;</w:t>
+      </w:r>
+      <w:r>
+        <w:br/>
+        <w:t>import org.springframework.web.bind.annotation.RequestMapping;</w:t>
+      </w:r>
+      <w:r>
+        <w:br/>
+        <w:t>import org.springframework.web.bind.annotation.RestController;</w:t>
       </w:r>
       <w:r>
         <w:br/>
@@ -1387,50 +1017,18 @@
       </w:r>
       <w:r>
         <w:br/>
-        <w:t xml:space="preserve">public class </w:t>
-      </w:r>
-      <w:proofErr w:type="spellStart"/>
-      <w:r>
-        <w:t>CustomHeaderVersioningApproachController</w:t>
-      </w:r>
-      <w:proofErr w:type="spellEnd"/>
-      <w:r>
-        <w:t xml:space="preserve"> {</w:t>
-      </w:r>
-      <w:r>
-        <w:br/>
-      </w:r>
-      <w:r>
-        <w:br/>
-        <w:t xml:space="preserve"> //so here you can see we are getting result on the basis of header version x-</w:t>
-      </w:r>
-      <w:proofErr w:type="spellStart"/>
-      <w:r>
-        <w:t>api</w:t>
-      </w:r>
-      <w:proofErr w:type="spellEnd"/>
-      <w:r>
-        <w:t>-version=1</w:t>
-      </w:r>
-      <w:r>
-        <w:br/>
-        <w:t xml:space="preserve">    @GetMapping(value = "/applicant" , headers= {"x-</w:t>
-      </w:r>
-      <w:proofErr w:type="spellStart"/>
-      <w:r>
-        <w:t>api</w:t>
-      </w:r>
-      <w:proofErr w:type="spellEnd"/>
-      <w:r>
-        <w:t xml:space="preserve">-version=1"}) //here we are declaring the custom </w:t>
-      </w:r>
-      <w:proofErr w:type="spellStart"/>
-      <w:r>
-        <w:t>api</w:t>
-      </w:r>
-      <w:proofErr w:type="spellEnd"/>
-      <w:r>
-        <w:t xml:space="preserve"> header any name you can take up to your application design</w:t>
+        <w:t>public class CustomHeaderVersioningApproachController {</w:t>
+      </w:r>
+      <w:r>
+        <w:br/>
+      </w:r>
+      <w:r>
+        <w:br/>
+        <w:t xml:space="preserve"> //so here you can see we are getting result on the basis of header version x-api-version=1</w:t>
+      </w:r>
+      <w:r>
+        <w:br/>
+        <w:t xml:space="preserve">    @GetMapping(value = "/applicant" , headers= {"x-api-version=1"}) //here we are declaring the custom api header any name you can take up to your application design</w:t>
       </w:r>
       <w:r>
         <w:br/>
@@ -1438,43 +1036,11 @@
       </w:r>
       <w:r>
         <w:br/>
-        <w:t xml:space="preserve">     </w:t>
-      </w:r>
-      <w:proofErr w:type="spellStart"/>
-      <w:r>
-        <w:t>ArrayList</w:t>
-      </w:r>
-      <w:proofErr w:type="spellEnd"/>
-      <w:r>
-        <w:t xml:space="preserve">&lt;ApplicantRsponseVersion1&gt; applicant = new </w:t>
-      </w:r>
-      <w:proofErr w:type="spellStart"/>
-      <w:r>
-        <w:t>ArrayList</w:t>
-      </w:r>
-      <w:proofErr w:type="spellEnd"/>
-      <w:r>
-        <w:t>&lt;&gt;();</w:t>
-      </w:r>
-      <w:r>
-        <w:br/>
-        <w:t xml:space="preserve">     </w:t>
-      </w:r>
-      <w:proofErr w:type="spellStart"/>
-      <w:r>
-        <w:t>applicant.add</w:t>
-      </w:r>
-      <w:proofErr w:type="spellEnd"/>
-      <w:r>
-        <w:t>(new ApplicantRsponseVersion1("</w:t>
-      </w:r>
-      <w:proofErr w:type="spellStart"/>
-      <w:r>
-        <w:t>vivek</w:t>
-      </w:r>
-      <w:proofErr w:type="spellEnd"/>
-      <w:r>
-        <w:t>", "31"));</w:t>
+        <w:t xml:space="preserve">     ArrayList&lt;ApplicantRsponseVersion1&gt; applicant = new ArrayList&lt;&gt;();</w:t>
+      </w:r>
+      <w:r>
+        <w:br/>
+        <w:t xml:space="preserve">     applicant.add(new ApplicantRsponseVersion1("vivek", "31"));</w:t>
       </w:r>
       <w:r>
         <w:br/>
@@ -1490,27 +1056,11 @@
       </w:r>
       <w:r>
         <w:br/>
-        <w:t xml:space="preserve">    //so here you can see we are getting result on the basis of header version x-</w:t>
-      </w:r>
-      <w:proofErr w:type="spellStart"/>
-      <w:r>
-        <w:t>api</w:t>
-      </w:r>
-      <w:proofErr w:type="spellEnd"/>
-      <w:r>
-        <w:t>-version=2</w:t>
-      </w:r>
-      <w:r>
-        <w:br/>
-        <w:t xml:space="preserve">    @GetMapping(value="/applicant" , headers = {"x-</w:t>
-      </w:r>
-      <w:proofErr w:type="spellStart"/>
-      <w:r>
-        <w:t>api</w:t>
-      </w:r>
-      <w:proofErr w:type="spellEnd"/>
-      <w:r>
-        <w:t xml:space="preserve">-version=2"}) </w:t>
+        <w:t xml:space="preserve">    //so here you can see we are getting result on the basis of header version x-api-version=2</w:t>
+      </w:r>
+      <w:r>
+        <w:br/>
+        <w:t xml:space="preserve">    @GetMapping(value="/applicant" , headers = {"x-api-version=2"}) </w:t>
       </w:r>
       <w:r>
         <w:br/>
@@ -1518,35 +1068,11 @@
       </w:r>
       <w:r>
         <w:br/>
-        <w:t xml:space="preserve">     </w:t>
-      </w:r>
-      <w:proofErr w:type="spellStart"/>
-      <w:r>
-        <w:t>ArrayList</w:t>
-      </w:r>
-      <w:proofErr w:type="spellEnd"/>
-      <w:r>
-        <w:t xml:space="preserve">&lt;ApplicantRsponseVersion2&gt; applicant = new </w:t>
-      </w:r>
-      <w:proofErr w:type="spellStart"/>
-      <w:r>
-        <w:t>ArrayList</w:t>
-      </w:r>
-      <w:proofErr w:type="spellEnd"/>
-      <w:r>
-        <w:t>&lt;&gt;();</w:t>
-      </w:r>
-      <w:r>
-        <w:br/>
-        <w:t xml:space="preserve">     </w:t>
-      </w:r>
-      <w:proofErr w:type="spellStart"/>
-      <w:r>
-        <w:t>applicant.add</w:t>
-      </w:r>
-      <w:proofErr w:type="spellEnd"/>
-      <w:r>
-        <w:t>(new ApplicantRsponseVersion2("ram", "34", "male"));</w:t>
+        <w:t xml:space="preserve">     ArrayList&lt;ApplicantRsponseVersion2&gt; applicant = new ArrayList&lt;&gt;();</w:t>
+      </w:r>
+      <w:r>
+        <w:br/>
+        <w:t xml:space="preserve">     applicant.add(new ApplicantRsponseVersion2("ram", "34", "male"));</w:t>
       </w:r>
       <w:r>
         <w:br/>
@@ -1576,6 +1102,9 @@
         <w:t>Press enter or click to view image in full size</w:t>
       </w:r>
       <w:r>
+        <w:rPr>
+          <w:noProof/>
+        </w:rPr>
         <w:drawing>
           <wp:inline distT="0" distB="0" distL="0" distR="0" wp14:anchorId="7F90F0E2" wp14:editId="70D1A6EC">
             <wp:extent cx="4701540" cy="4998720"/>
@@ -1632,6 +1161,9 @@
         <w:t>Press enter or click to view image in full size</w:t>
       </w:r>
       <w:r>
+        <w:rPr>
+          <w:noProof/>
+        </w:rPr>
         <w:drawing>
           <wp:inline distT="0" distB="0" distL="0" distR="0" wp14:anchorId="767602D6" wp14:editId="0F388022">
             <wp:extent cx="4831080" cy="4884420"/>
@@ -1704,21 +1236,8 @@
       </w:r>
     </w:p>
     <w:p>
-      <w:proofErr w:type="gramStart"/>
-      <w:r>
-        <w:t>Example :</w:t>
-      </w:r>
-      <w:proofErr w:type="gramEnd"/>
-      <w:r>
-        <w:t xml:space="preserve"> </w:t>
-      </w:r>
-      <w:proofErr w:type="gramStart"/>
-      <w:r>
-        <w:t>headers[</w:t>
-      </w:r>
-      <w:proofErr w:type="gramEnd"/>
-      <w:r>
-        <w:t>Accept=application/</w:t>
+      <w:r>
+        <w:t>Example : headers[Accept=application/</w:t>
       </w:r>
       <w:r>
         <w:rPr>
@@ -1732,13 +1251,8 @@
       </w:r>
     </w:p>
     <w:p>
-      <w:proofErr w:type="gramStart"/>
-      <w:r>
-        <w:t>headers[</w:t>
-      </w:r>
-      <w:proofErr w:type="gramEnd"/>
-      <w:r>
-        <w:t>Accept=application/</w:t>
+      <w:r>
+        <w:t>headers[Accept=application/</w:t>
       </w:r>
       <w:r>
         <w:rPr>
@@ -1758,84 +1272,36 @@
     </w:p>
     <w:p>
       <w:r>
-        <w:t xml:space="preserve">package </w:t>
-      </w:r>
-      <w:proofErr w:type="spellStart"/>
-      <w:r>
-        <w:t>com.api.verioning.ApiVersioning.controller</w:t>
-      </w:r>
-      <w:proofErr w:type="spellEnd"/>
-      <w:r>
-        <w:t>;</w:t>
-      </w:r>
-      <w:r>
-        <w:br/>
-      </w:r>
-      <w:r>
-        <w:br/>
-        <w:t xml:space="preserve">import </w:t>
-      </w:r>
-      <w:proofErr w:type="spellStart"/>
-      <w:r>
-        <w:t>java.util.ArrayList</w:t>
-      </w:r>
-      <w:proofErr w:type="spellEnd"/>
-      <w:r>
-        <w:t>;</w:t>
-      </w:r>
-      <w:r>
-        <w:br/>
-        <w:t xml:space="preserve">import </w:t>
-      </w:r>
-      <w:proofErr w:type="spellStart"/>
-      <w:r>
-        <w:t>java.util.List</w:t>
-      </w:r>
-      <w:proofErr w:type="spellEnd"/>
-      <w:r>
-        <w:t>;</w:t>
-      </w:r>
-      <w:r>
-        <w:br/>
-      </w:r>
-      <w:r>
-        <w:br/>
-        <w:t xml:space="preserve">import </w:t>
-      </w:r>
-      <w:proofErr w:type="spellStart"/>
-      <w:r>
-        <w:t>org.springframework.web.bind.annotation.GetMapping</w:t>
-      </w:r>
-      <w:proofErr w:type="spellEnd"/>
-      <w:r>
-        <w:t>;</w:t>
+        <w:t>package com.api.verioning.ApiVersioning.controller;</w:t>
+      </w:r>
+      <w:r>
+        <w:br/>
+      </w:r>
+      <w:r>
+        <w:br/>
+        <w:t>import java.util.ArrayList;</w:t>
+      </w:r>
+      <w:r>
+        <w:br/>
+        <w:t>import java.util.List;</w:t>
+      </w:r>
+      <w:r>
+        <w:br/>
+      </w:r>
+      <w:r>
+        <w:br/>
+        <w:t>import org.springframework.web.bind.annotation.GetMapping;</w:t>
       </w:r>
       <w:r>
         <w:br/>
       </w:r>
       <w:r>
         <w:lastRenderedPageBreak/>
-        <w:t xml:space="preserve">import </w:t>
-      </w:r>
-      <w:proofErr w:type="spellStart"/>
-      <w:r>
-        <w:t>org.springframework.web.bind.annotation.RequestMapping</w:t>
-      </w:r>
-      <w:proofErr w:type="spellEnd"/>
-      <w:r>
-        <w:t>;</w:t>
-      </w:r>
-      <w:r>
-        <w:br/>
-        <w:t xml:space="preserve">import </w:t>
-      </w:r>
-      <w:proofErr w:type="spellStart"/>
-      <w:r>
-        <w:t>org.springframework.web.bind.annotation.RestController</w:t>
-      </w:r>
-      <w:proofErr w:type="spellEnd"/>
-      <w:r>
-        <w:t>;</w:t>
+        <w:t>import org.springframework.web.bind.annotation.RequestMapping;</w:t>
+      </w:r>
+      <w:r>
+        <w:br/>
+        <w:t>import org.springframework.web.bind.annotation.RestController;</w:t>
       </w:r>
       <w:r>
         <w:br/>
@@ -1857,13 +1323,8 @@
       </w:r>
       <w:r>
         <w:br/>
-        <w:t xml:space="preserve"> * This approach we are dealing with the content that we are going to accept /produce in </w:t>
-      </w:r>
-      <w:proofErr w:type="spellStart"/>
-      <w:r>
-        <w:t>api</w:t>
-      </w:r>
-      <w:proofErr w:type="spellEnd"/>
+        <w:t xml:space="preserve"> * This approach we are dealing with the content that we are going to accept /produce in api</w:t>
+      </w:r>
       <w:r>
         <w:br/>
         <w:t xml:space="preserve"> * </w:t>
@@ -1896,15 +1357,7 @@
       </w:r>
       <w:r>
         <w:br/>
-        <w:t xml:space="preserve">public class </w:t>
-      </w:r>
-      <w:proofErr w:type="spellStart"/>
-      <w:r>
-        <w:t>ContentNegotiationVersioningApproachController</w:t>
-      </w:r>
-      <w:proofErr w:type="spellEnd"/>
-      <w:r>
-        <w:t xml:space="preserve"> {</w:t>
+        <w:t>public class ContentNegotiationVersioningApproachController {</w:t>
       </w:r>
       <w:r>
         <w:br/>
@@ -1923,43 +1376,11 @@
       </w:r>
       <w:r>
         <w:br/>
-        <w:t xml:space="preserve">     </w:t>
-      </w:r>
-      <w:proofErr w:type="spellStart"/>
-      <w:r>
-        <w:t>ArrayList</w:t>
-      </w:r>
-      <w:proofErr w:type="spellEnd"/>
-      <w:r>
-        <w:t xml:space="preserve">&lt;ApplicantRsponseVersion1&gt; applicant = new </w:t>
-      </w:r>
-      <w:proofErr w:type="spellStart"/>
-      <w:r>
-        <w:t>ArrayList</w:t>
-      </w:r>
-      <w:proofErr w:type="spellEnd"/>
-      <w:r>
-        <w:t>&lt;&gt;();</w:t>
-      </w:r>
-      <w:r>
-        <w:br/>
-        <w:t xml:space="preserve">     </w:t>
-      </w:r>
-      <w:proofErr w:type="spellStart"/>
-      <w:r>
-        <w:t>applicant.add</w:t>
-      </w:r>
-      <w:proofErr w:type="spellEnd"/>
-      <w:r>
-        <w:t>(new ApplicantRsponseVersion1("</w:t>
-      </w:r>
-      <w:proofErr w:type="spellStart"/>
-      <w:r>
-        <w:t>vivek</w:t>
-      </w:r>
-      <w:proofErr w:type="spellEnd"/>
-      <w:r>
-        <w:t>", "31"));</w:t>
+        <w:t xml:space="preserve">     ArrayList&lt;ApplicantRsponseVersion1&gt; applicant = new ArrayList&lt;&gt;();</w:t>
+      </w:r>
+      <w:r>
+        <w:br/>
+        <w:t xml:space="preserve">     applicant.add(new ApplicantRsponseVersion1("vivek", "31"));</w:t>
       </w:r>
       <w:r>
         <w:br/>
@@ -1987,35 +1408,11 @@
       </w:r>
       <w:r>
         <w:br/>
-        <w:t xml:space="preserve">     </w:t>
-      </w:r>
-      <w:proofErr w:type="spellStart"/>
-      <w:r>
-        <w:t>ArrayList</w:t>
-      </w:r>
-      <w:proofErr w:type="spellEnd"/>
-      <w:r>
-        <w:t xml:space="preserve">&lt;ApplicantRsponseVersion2&gt; applicant = new </w:t>
-      </w:r>
-      <w:proofErr w:type="spellStart"/>
-      <w:r>
-        <w:t>ArrayList</w:t>
-      </w:r>
-      <w:proofErr w:type="spellEnd"/>
-      <w:r>
-        <w:t>&lt;&gt;();</w:t>
-      </w:r>
-      <w:r>
-        <w:br/>
-        <w:t xml:space="preserve">     </w:t>
-      </w:r>
-      <w:proofErr w:type="spellStart"/>
-      <w:r>
-        <w:t>applicant.add</w:t>
-      </w:r>
-      <w:proofErr w:type="spellEnd"/>
-      <w:r>
-        <w:t>(new ApplicantRsponseVersion2("ram", "34", "male"));</w:t>
+        <w:t xml:space="preserve">     ArrayList&lt;ApplicantRsponseVersion2&gt; applicant = new ArrayList&lt;&gt;();</w:t>
+      </w:r>
+      <w:r>
+        <w:br/>
+        <w:t xml:space="preserve">     applicant.add(new ApplicantRsponseVersion2("ram", "34", "male"));</w:t>
       </w:r>
       <w:r>
         <w:br/>
@@ -2045,6 +1442,9 @@
         <w:t>Press enter or click to view image in full size</w:t>
       </w:r>
       <w:r>
+        <w:rPr>
+          <w:noProof/>
+        </w:rPr>
         <w:drawing>
           <wp:inline distT="0" distB="0" distL="0" distR="0" wp14:anchorId="2857CBF2" wp14:editId="0A13AA86">
             <wp:extent cx="4495800" cy="5547360"/>
@@ -2101,6 +1501,9 @@
         <w:t>Press enter or click to view image in full size</w:t>
       </w:r>
       <w:r>
+        <w:rPr>
+          <w:noProof/>
+        </w:rPr>
         <w:drawing>
           <wp:inline distT="0" distB="0" distL="0" distR="0" wp14:anchorId="4B37D4A9" wp14:editId="336ED4B5">
             <wp:extent cx="5036820" cy="4937760"/>
@@ -2169,15 +1572,7 @@
         <w:t>iv) Query Parameter Versioning: </w:t>
       </w:r>
       <w:r>
-        <w:t xml:space="preserve">As Name suggesting when you are bifurcating your old and new rest </w:t>
-      </w:r>
-      <w:proofErr w:type="gramStart"/>
-      <w:r>
-        <w:t>API’s</w:t>
-      </w:r>
-      <w:proofErr w:type="gramEnd"/>
-      <w:r>
-        <w:t xml:space="preserve"> on the basis of query parameter.</w:t>
+        <w:t>As Name suggesting when you are bifurcating your old and new rest API’s on the basis of query parameter.</w:t>
       </w:r>
     </w:p>
     <w:p>
@@ -2186,21 +1581,12 @@
       </w:r>
     </w:p>
     <w:p>
-      <w:proofErr w:type="gramStart"/>
-      <w:r>
-        <w:rPr>
-          <w:b/>
-          <w:bCs/>
-        </w:rPr>
-        <w:t>OLD :</w:t>
-      </w:r>
-      <w:proofErr w:type="gramEnd"/>
-      <w:r>
-        <w:rPr>
-          <w:b/>
-          <w:bCs/>
-        </w:rPr>
-        <w:t> </w:t>
+      <w:r>
+        <w:rPr>
+          <w:b/>
+          <w:bCs/>
+        </w:rPr>
+        <w:t>OLD : </w:t>
       </w:r>
       <w:hyperlink r:id="rId20" w:tgtFrame="_blank" w:history="1">
         <w:r>
@@ -2212,7 +1598,6 @@
       </w:hyperlink>
     </w:p>
     <w:p>
-      <w:proofErr w:type="gramStart"/>
       <w:r>
         <w:rPr>
           <w:b/>
@@ -2220,25 +1605,14 @@
         </w:rPr>
         <w:t>New :</w:t>
       </w:r>
-      <w:proofErr w:type="gramEnd"/>
-      <w:r>
-        <w:fldChar w:fldCharType="begin"/>
-      </w:r>
-      <w:r>
-        <w:instrText>HYPERLINK "http://localhost:8989/query/api/applicant?version=1" \t "_blank"</w:instrText>
-      </w:r>
-      <w:r>
-        <w:fldChar w:fldCharType="separate"/>
-      </w:r>
-      <w:r>
-        <w:rPr>
-          <w:rStyle w:val="Hyperlink"/>
-        </w:rPr>
-        <w:t>http://localhost:8989/query/api/applicant?version=</w:t>
-      </w:r>
-      <w:r>
-        <w:fldChar w:fldCharType="end"/>
-      </w:r>
+      <w:hyperlink r:id="rId21" w:tgtFrame="_blank" w:history="1">
+        <w:r>
+          <w:rPr>
+            <w:rStyle w:val="Hyperlink"/>
+          </w:rPr>
+          <w:t>http://localhost:8989/query/api/applicant?version=</w:t>
+        </w:r>
+      </w:hyperlink>
       <w:r>
         <w:t>2</w:t>
       </w:r>
@@ -2249,98 +1623,41 @@
           <w:b/>
           <w:bCs/>
         </w:rPr>
-        <w:t xml:space="preserve">Check code for the </w:t>
-      </w:r>
-      <w:proofErr w:type="gramStart"/>
-      <w:r>
-        <w:rPr>
-          <w:b/>
-          <w:bCs/>
-        </w:rPr>
-        <w:t>same :</w:t>
-      </w:r>
-      <w:proofErr w:type="gramEnd"/>
-    </w:p>
-    <w:p>
-      <w:r>
-        <w:t xml:space="preserve">package </w:t>
-      </w:r>
-      <w:proofErr w:type="spellStart"/>
-      <w:r>
-        <w:t>com.api.verioning.ApiVersioning.controller</w:t>
-      </w:r>
-      <w:proofErr w:type="spellEnd"/>
-      <w:r>
-        <w:t>;</w:t>
-      </w:r>
-      <w:r>
-        <w:br/>
-      </w:r>
-      <w:r>
-        <w:br/>
-        <w:t xml:space="preserve">import </w:t>
-      </w:r>
-      <w:proofErr w:type="spellStart"/>
-      <w:r>
-        <w:t>java.util.ArrayList</w:t>
-      </w:r>
-      <w:proofErr w:type="spellEnd"/>
-      <w:r>
-        <w:t>;</w:t>
-      </w:r>
-      <w:r>
-        <w:br/>
-        <w:t xml:space="preserve">import </w:t>
-      </w:r>
-      <w:proofErr w:type="spellStart"/>
-      <w:r>
-        <w:t>java.util.List</w:t>
-      </w:r>
-      <w:proofErr w:type="spellEnd"/>
-      <w:r>
-        <w:t>;</w:t>
-      </w:r>
-      <w:r>
-        <w:br/>
-      </w:r>
-      <w:r>
-        <w:br/>
-        <w:t xml:space="preserve">import </w:t>
-      </w:r>
-      <w:proofErr w:type="spellStart"/>
-      <w:r>
-        <w:t>org.springframework.web.bind.annotation.GetMapping</w:t>
-      </w:r>
-      <w:proofErr w:type="spellEnd"/>
-      <w:r>
-        <w:t>;</w:t>
+        <w:t>Check code for the same :</w:t>
+      </w:r>
+    </w:p>
+    <w:p>
+      <w:r>
+        <w:t>package com.api.verioning.ApiVersioning.controller;</w:t>
+      </w:r>
+      <w:r>
+        <w:br/>
+      </w:r>
+      <w:r>
+        <w:br/>
+        <w:t>import java.util.ArrayList;</w:t>
+      </w:r>
+      <w:r>
+        <w:br/>
+        <w:t>import java.util.List;</w:t>
+      </w:r>
+      <w:r>
+        <w:br/>
+      </w:r>
+      <w:r>
+        <w:br/>
+        <w:t>import org.springframework.web.bind.annotation.GetMapping;</w:t>
       </w:r>
       <w:r>
         <w:br/>
       </w:r>
       <w:r>
         <w:lastRenderedPageBreak/>
-        <w:t xml:space="preserve">import </w:t>
-      </w:r>
-      <w:proofErr w:type="spellStart"/>
-      <w:r>
-        <w:t>org.springframework.web.bind.annotation.RequestMapping</w:t>
-      </w:r>
-      <w:proofErr w:type="spellEnd"/>
-      <w:r>
-        <w:t>;</w:t>
-      </w:r>
-      <w:r>
-        <w:br/>
-        <w:t xml:space="preserve">import </w:t>
-      </w:r>
-      <w:proofErr w:type="spellStart"/>
-      <w:r>
-        <w:t>org.springframework.web.bind.annotation.RestController</w:t>
-      </w:r>
-      <w:proofErr w:type="spellEnd"/>
-      <w:r>
-        <w:t>;</w:t>
+        <w:t>import org.springframework.web.bind.annotation.RequestMapping;</w:t>
+      </w:r>
+      <w:r>
+        <w:br/>
+        <w:t>import org.springframework.web.bind.annotation.RestController;</w:t>
       </w:r>
       <w:r>
         <w:br/>
@@ -2396,15 +1713,7 @@
       </w:r>
       <w:r>
         <w:br/>
-        <w:t xml:space="preserve">public class </w:t>
-      </w:r>
-      <w:proofErr w:type="spellStart"/>
-      <w:r>
-        <w:t>QueryParameterControllerApproachController</w:t>
-      </w:r>
-      <w:proofErr w:type="spellEnd"/>
-      <w:r>
-        <w:t xml:space="preserve"> {</w:t>
+        <w:t>public class QueryParameterControllerApproachController {</w:t>
       </w:r>
       <w:r>
         <w:br/>
@@ -2423,43 +1732,11 @@
       </w:r>
       <w:r>
         <w:br/>
-        <w:t xml:space="preserve">     </w:t>
-      </w:r>
-      <w:proofErr w:type="spellStart"/>
-      <w:r>
-        <w:t>ArrayList</w:t>
-      </w:r>
-      <w:proofErr w:type="spellEnd"/>
-      <w:r>
-        <w:t xml:space="preserve">&lt;ApplicantRsponseVersion1&gt; applicant = new </w:t>
-      </w:r>
-      <w:proofErr w:type="spellStart"/>
-      <w:r>
-        <w:t>ArrayList</w:t>
-      </w:r>
-      <w:proofErr w:type="spellEnd"/>
-      <w:r>
-        <w:t>&lt;&gt;();</w:t>
-      </w:r>
-      <w:r>
-        <w:br/>
-        <w:t xml:space="preserve">     </w:t>
-      </w:r>
-      <w:proofErr w:type="spellStart"/>
-      <w:r>
-        <w:t>applicant.add</w:t>
-      </w:r>
-      <w:proofErr w:type="spellEnd"/>
-      <w:r>
-        <w:t>(new ApplicantRsponseVersion1("</w:t>
-      </w:r>
-      <w:proofErr w:type="spellStart"/>
-      <w:r>
-        <w:t>vivek</w:t>
-      </w:r>
-      <w:proofErr w:type="spellEnd"/>
-      <w:r>
-        <w:t>", "31"));</w:t>
+        <w:t xml:space="preserve">     ArrayList&lt;ApplicantRsponseVersion1&gt; applicant = new ArrayList&lt;&gt;();</w:t>
+      </w:r>
+      <w:r>
+        <w:br/>
+        <w:t xml:space="preserve">     applicant.add(new ApplicantRsponseVersion1("vivek", "31"));</w:t>
       </w:r>
       <w:r>
         <w:br/>
@@ -2487,35 +1764,11 @@
       </w:r>
       <w:r>
         <w:br/>
-        <w:t xml:space="preserve">     </w:t>
-      </w:r>
-      <w:proofErr w:type="spellStart"/>
-      <w:r>
-        <w:t>ArrayList</w:t>
-      </w:r>
-      <w:proofErr w:type="spellEnd"/>
-      <w:r>
-        <w:t xml:space="preserve">&lt;ApplicantRsponseVersion2&gt; applicant = new </w:t>
-      </w:r>
-      <w:proofErr w:type="spellStart"/>
-      <w:r>
-        <w:t>ArrayList</w:t>
-      </w:r>
-      <w:proofErr w:type="spellEnd"/>
-      <w:r>
-        <w:t>&lt;&gt;();</w:t>
-      </w:r>
-      <w:r>
-        <w:br/>
-        <w:t xml:space="preserve">     </w:t>
-      </w:r>
-      <w:proofErr w:type="spellStart"/>
-      <w:r>
-        <w:t>applicant.add</w:t>
-      </w:r>
-      <w:proofErr w:type="spellEnd"/>
-      <w:r>
-        <w:t>(new ApplicantRsponseVersion2("ram", "34", "male"));</w:t>
+        <w:t xml:space="preserve">     ArrayList&lt;ApplicantRsponseVersion2&gt; applicant = new ArrayList&lt;&gt;();</w:t>
+      </w:r>
+      <w:r>
+        <w:br/>
+        <w:t xml:space="preserve">     applicant.add(new ApplicantRsponseVersion2("ram", "34", "male"));</w:t>
       </w:r>
       <w:r>
         <w:br/>
@@ -2545,6 +1798,9 @@
         <w:t>Press enter or click to view image in full size</w:t>
       </w:r>
       <w:r>
+        <w:rPr>
+          <w:noProof/>
+        </w:rPr>
         <w:drawing>
           <wp:inline distT="0" distB="0" distL="0" distR="0" wp14:anchorId="37E637C1" wp14:editId="1FB4720F">
             <wp:extent cx="5021580" cy="3977640"/>
@@ -2563,7 +1819,7 @@
                     </pic:cNvPicPr>
                   </pic:nvPicPr>
                   <pic:blipFill>
-                    <a:blip r:embed="rId21">
+                    <a:blip r:embed="rId22">
                       <a:extLst>
                         <a:ext uri="{28A0092B-C50C-407E-A947-70E740481C1C}">
                           <a14:useLocalDpi xmlns:a14="http://schemas.microsoft.com/office/drawing/2010/main" val="0"/>
@@ -2601,6 +1857,9 @@
         <w:t>Press enter or click to view image in full size</w:t>
       </w:r>
       <w:r>
+        <w:rPr>
+          <w:noProof/>
+        </w:rPr>
         <w:drawing>
           <wp:inline distT="0" distB="0" distL="0" distR="0" wp14:anchorId="15F5B138" wp14:editId="5DF9F2D4">
             <wp:extent cx="4518660" cy="4358640"/>
@@ -2619,7 +1878,7 @@
                     </pic:cNvPicPr>
                   </pic:nvPicPr>
                   <pic:blipFill>
-                    <a:blip r:embed="rId22">
+                    <a:blip r:embed="rId23">
                       <a:extLst>
                         <a:ext uri="{28A0092B-C50C-407E-A947-70E740481C1C}">
                           <a14:useLocalDpi xmlns:a14="http://schemas.microsoft.com/office/drawing/2010/main" val="0"/>
@@ -2689,7 +1948,7 @@
     </w:p>
     <w:p/>
     <w:p>
-      <w:hyperlink r:id="rId23" w:history="1">
+      <w:hyperlink r:id="rId24" w:history="1">
         <w:r>
           <w:rPr>
             <w:rStyle w:val="Hyperlink"/>
@@ -2714,7 +1973,7 @@
       </w:r>
     </w:p>
     <w:p>
-      <w:hyperlink r:id="rId24" w:history="1">
+      <w:hyperlink r:id="rId25" w:history="1">
         <w:r>
           <w:rPr>
             <w:rStyle w:val="Hyperlink"/>
@@ -2760,6 +2019,9 @@
         </w:r>
       </w:hyperlink>
       <w:r>
+        <w:rPr>
+          <w:noProof/>
+        </w:rPr>
         <mc:AlternateContent>
           <mc:Choice Requires="wps">
             <w:drawing>
@@ -2880,7 +2142,7 @@
       </w:r>
     </w:p>
     <w:p>
-      <w:hyperlink r:id="rId25" w:history="1">
+      <w:hyperlink r:id="rId26" w:history="1">
         <w:r>
           <w:rPr>
             <w:rStyle w:val="Hyperlink"/>
@@ -3103,23 +2365,7 @@
           <w:b/>
           <w:bCs/>
         </w:rPr>
-        <w:t>(a) Version in URL — /</w:t>
-      </w:r>
-      <w:proofErr w:type="spellStart"/>
-      <w:r>
-        <w:rPr>
-          <w:b/>
-          <w:bCs/>
-        </w:rPr>
-        <w:t>api</w:t>
-      </w:r>
-      <w:proofErr w:type="spellEnd"/>
-      <w:r>
-        <w:rPr>
-          <w:b/>
-          <w:bCs/>
-        </w:rPr>
-        <w:t>/v1/products</w:t>
+        <w:t>(a) Version in URL — /api/v1/products</w:t>
       </w:r>
     </w:p>
     <w:p>
@@ -3192,39 +2438,7 @@
           <w:b/>
           <w:bCs/>
         </w:rPr>
-        <w:t>(b) Version in Query Params — /</w:t>
-      </w:r>
-      <w:proofErr w:type="spellStart"/>
-      <w:r>
-        <w:rPr>
-          <w:b/>
-          <w:bCs/>
-        </w:rPr>
-        <w:t>api</w:t>
-      </w:r>
-      <w:proofErr w:type="spellEnd"/>
-      <w:r>
-        <w:rPr>
-          <w:b/>
-          <w:bCs/>
-        </w:rPr>
-        <w:t>/</w:t>
-      </w:r>
-      <w:proofErr w:type="spellStart"/>
-      <w:r>
-        <w:rPr>
-          <w:b/>
-          <w:bCs/>
-        </w:rPr>
-        <w:t>products?version</w:t>
-      </w:r>
-      <w:proofErr w:type="spellEnd"/>
-      <w:r>
-        <w:rPr>
-          <w:b/>
-          <w:bCs/>
-        </w:rPr>
-        <w:t>=1</w:t>
+        <w:t>(b) Version in Query Params — /api/products?version=1</w:t>
       </w:r>
     </w:p>
     <w:p>
@@ -3284,23 +2498,7 @@
           <w:bCs/>
         </w:rPr>
         <w:lastRenderedPageBreak/>
-        <w:t xml:space="preserve">© Version in Headers — Accept: </w:t>
-      </w:r>
-      <w:proofErr w:type="gramStart"/>
-      <w:r>
-        <w:rPr>
-          <w:b/>
-          <w:bCs/>
-        </w:rPr>
-        <w:t>application/vnd.myapp.v</w:t>
-      </w:r>
-      <w:proofErr w:type="gramEnd"/>
-      <w:r>
-        <w:rPr>
-          <w:b/>
-          <w:bCs/>
-        </w:rPr>
-        <w:t>1+json</w:t>
+        <w:t>© Version in Headers — Accept: application/vnd.myapp.v1+json</w:t>
       </w:r>
     </w:p>
     <w:p>
@@ -3494,20 +2692,7 @@
     </w:p>
     <w:p>
       <w:r>
-        <w:t xml:space="preserve">    public String </w:t>
-      </w:r>
-      <w:proofErr w:type="spellStart"/>
-      <w:proofErr w:type="gramStart"/>
-      <w:r>
-        <w:t>getProducts</w:t>
-      </w:r>
-      <w:proofErr w:type="spellEnd"/>
-      <w:r>
-        <w:t>(</w:t>
-      </w:r>
-      <w:proofErr w:type="gramEnd"/>
-      <w:r>
-        <w:t>) {</w:t>
+        <w:t xml:space="preserve">    public String getProducts() {</w:t>
       </w:r>
     </w:p>
     <w:p>
@@ -3562,20 +2747,7 @@
     </w:p>
     <w:p>
       <w:r>
-        <w:t xml:space="preserve">    public String </w:t>
-      </w:r>
-      <w:proofErr w:type="spellStart"/>
-      <w:proofErr w:type="gramStart"/>
-      <w:r>
-        <w:t>getProducts</w:t>
-      </w:r>
-      <w:proofErr w:type="spellEnd"/>
-      <w:r>
-        <w:t>(</w:t>
-      </w:r>
-      <w:proofErr w:type="gramEnd"/>
-      <w:r>
-        <w:t>) {</w:t>
+        <w:t xml:space="preserve">    public String getProducts() {</w:t>
       </w:r>
     </w:p>
     <w:p>
@@ -3619,13 +2791,14 @@
           <w:rStyle w:val="Hyperlink"/>
           <w:b/>
           <w:bCs/>
+          <w:noProof/>
         </w:rPr>
         <w:drawing>
           <wp:inline distT="0" distB="0" distL="0" distR="0" wp14:anchorId="3406B606" wp14:editId="6AB1CCB2">
             <wp:extent cx="5731510" cy="3223895"/>
             <wp:effectExtent l="0" t="0" r="2540" b="0"/>
             <wp:docPr id="1757431379" name="Picture 43" descr="API Versioning Necessary Evil or Avoidable Complexity">
-              <a:hlinkClick xmlns:a="http://schemas.openxmlformats.org/drawingml/2006/main" r:id="rId26"/>
+              <a:hlinkClick xmlns:a="http://schemas.openxmlformats.org/drawingml/2006/main" r:id="rId27"/>
             </wp:docPr>
             <wp:cNvGraphicFramePr>
               <a:graphicFrameLocks xmlns:a="http://schemas.openxmlformats.org/drawingml/2006/main" noChangeAspect="1"/>
@@ -3635,14 +2808,14 @@
                 <pic:pic xmlns:pic="http://schemas.openxmlformats.org/drawingml/2006/picture">
                   <pic:nvPicPr>
                     <pic:cNvPr id="0" name="Picture 148" descr="API Versioning Necessary Evil or Avoidable Complexity">
-                      <a:hlinkClick r:id="rId26"/>
+                      <a:hlinkClick r:id="rId27"/>
                     </pic:cNvPr>
                     <pic:cNvPicPr>
                       <a:picLocks noChangeAspect="1" noChangeArrowheads="1"/>
                     </pic:cNvPicPr>
                   </pic:nvPicPr>
                   <pic:blipFill>
-                    <a:blip r:embed="rId27">
+                    <a:blip r:embed="rId28">
                       <a:extLst>
                         <a:ext uri="{28A0092B-C50C-407E-A947-70E740481C1C}">
                           <a14:useLocalDpi xmlns:a14="http://schemas.microsoft.com/office/drawing/2010/main" val="0"/>
@@ -3695,63 +2868,48 @@
           <w:rStyle w:val="Hyperlink"/>
         </w:rPr>
       </w:pPr>
-      <w:proofErr w:type="spellStart"/>
-      <w:proofErr w:type="gramStart"/>
       <w:r>
         <w:rPr>
           <w:rStyle w:val="Hyperlink"/>
         </w:rPr>
-        <w:t>Keleos</w:t>
-      </w:r>
-      <w:proofErr w:type="spellEnd"/>
-      <w:r>
+        <w:t>Keleos  9 months ago</w:t>
+      </w:r>
+    </w:p>
+    <w:p>
+      <w:r>
+        <w:fldChar w:fldCharType="end"/>
+      </w:r>
+    </w:p>
+    <w:p>
+      <w:pPr>
         <w:rPr>
           <w:rStyle w:val="Hyperlink"/>
-        </w:rPr>
-        <w:t>  9</w:t>
-      </w:r>
-      <w:proofErr w:type="gramEnd"/>
+          <w:b/>
+          <w:bCs/>
+        </w:rPr>
+      </w:pPr>
+      <w:r>
+        <w:fldChar w:fldCharType="begin"/>
+      </w:r>
+      <w:r>
+        <w:instrText>HYPERLINK "https://www.linkedin.com/pulse/api-versioning-nodejs-harshal-yeole"</w:instrText>
+      </w:r>
+      <w:r>
+        <w:fldChar w:fldCharType="separate"/>
+      </w:r>
       <w:r>
         <w:rPr>
           <w:rStyle w:val="Hyperlink"/>
-        </w:rPr>
-        <w:t xml:space="preserve"> months ago</w:t>
-      </w:r>
-    </w:p>
-    <w:p>
-      <w:r>
-        <w:fldChar w:fldCharType="end"/>
-      </w:r>
-    </w:p>
-    <w:p>
-      <w:pPr>
-        <w:rPr>
-          <w:rStyle w:val="Hyperlink"/>
-          <w:b/>
-          <w:bCs/>
-        </w:rPr>
-      </w:pPr>
-      <w:r>
-        <w:fldChar w:fldCharType="begin"/>
-      </w:r>
-      <w:r>
-        <w:instrText>HYPERLINK "https://www.linkedin.com/pulse/api-versioning-nodejs-harshal-yeole"</w:instrText>
-      </w:r>
-      <w:r>
-        <w:fldChar w:fldCharType="separate"/>
-      </w:r>
-      <w:r>
-        <w:rPr>
-          <w:rStyle w:val="Hyperlink"/>
-          <w:b/>
-          <w:bCs/>
+          <w:b/>
+          <w:bCs/>
+          <w:noProof/>
         </w:rPr>
         <w:drawing>
           <wp:inline distT="0" distB="0" distL="0" distR="0" wp14:anchorId="0081D2B5" wp14:editId="41B79B57">
             <wp:extent cx="5731510" cy="3223895"/>
             <wp:effectExtent l="0" t="0" r="2540" b="0"/>
             <wp:docPr id="572277121" name="Picture 42" descr="API Versioning with Node.js">
-              <a:hlinkClick xmlns:a="http://schemas.openxmlformats.org/drawingml/2006/main" r:id="rId28"/>
+              <a:hlinkClick xmlns:a="http://schemas.openxmlformats.org/drawingml/2006/main" r:id="rId29"/>
             </wp:docPr>
             <wp:cNvGraphicFramePr>
               <a:graphicFrameLocks xmlns:a="http://schemas.openxmlformats.org/drawingml/2006/main" noChangeAspect="1"/>
@@ -3761,14 +2919,14 @@
                 <pic:pic xmlns:pic="http://schemas.openxmlformats.org/drawingml/2006/picture">
                   <pic:nvPicPr>
                     <pic:cNvPr id="0" name="Picture 149" descr="API Versioning with Node.js">
-                      <a:hlinkClick r:id="rId28"/>
+                      <a:hlinkClick r:id="rId29"/>
                     </pic:cNvPr>
                     <pic:cNvPicPr>
                       <a:picLocks noChangeAspect="1" noChangeArrowheads="1"/>
                     </pic:cNvPicPr>
                   </pic:nvPicPr>
                   <pic:blipFill>
-                    <a:blip r:embed="rId29">
+                    <a:blip r:embed="rId30">
                       <a:extLst>
                         <a:ext uri="{28A0092B-C50C-407E-A947-70E740481C1C}">
                           <a14:useLocalDpi xmlns:a14="http://schemas.microsoft.com/office/drawing/2010/main" val="0"/>
@@ -3826,65 +2984,44 @@
         <w:rPr>
           <w:rStyle w:val="Hyperlink"/>
         </w:rPr>
-        <w:t xml:space="preserve">Harshal </w:t>
-      </w:r>
-      <w:proofErr w:type="spellStart"/>
-      <w:proofErr w:type="gramStart"/>
-      <w:r>
+        <w:t>Harshal Yeole  4 years ago</w:t>
+      </w:r>
+    </w:p>
+    <w:p>
+      <w:r>
+        <w:fldChar w:fldCharType="end"/>
+      </w:r>
+    </w:p>
+    <w:p>
+      <w:pPr>
         <w:rPr>
           <w:rStyle w:val="Hyperlink"/>
-        </w:rPr>
-        <w:t>Yeole</w:t>
-      </w:r>
-      <w:proofErr w:type="spellEnd"/>
+          <w:b/>
+          <w:bCs/>
+        </w:rPr>
+      </w:pPr>
+      <w:r>
+        <w:fldChar w:fldCharType="begin"/>
+      </w:r>
+      <w:r>
+        <w:instrText>HYPERLINK "https://www.linkedin.com/pulse/rest-api-versioning-spring-7spring-boot-4-mike-lythgoe-t7zje"</w:instrText>
+      </w:r>
+      <w:r>
+        <w:fldChar w:fldCharType="separate"/>
+      </w:r>
       <w:r>
         <w:rPr>
           <w:rStyle w:val="Hyperlink"/>
-        </w:rPr>
-        <w:t>  4</w:t>
-      </w:r>
-      <w:proofErr w:type="gramEnd"/>
-      <w:r>
-        <w:rPr>
-          <w:rStyle w:val="Hyperlink"/>
-        </w:rPr>
-        <w:t xml:space="preserve"> years ago</w:t>
-      </w:r>
-    </w:p>
-    <w:p>
-      <w:r>
-        <w:fldChar w:fldCharType="end"/>
-      </w:r>
-    </w:p>
-    <w:p>
-      <w:pPr>
-        <w:rPr>
-          <w:rStyle w:val="Hyperlink"/>
-          <w:b/>
-          <w:bCs/>
-        </w:rPr>
-      </w:pPr>
-      <w:r>
-        <w:fldChar w:fldCharType="begin"/>
-      </w:r>
-      <w:r>
-        <w:instrText>HYPERLINK "https://www.linkedin.com/pulse/rest-api-versioning-spring-7spring-boot-4-mike-lythgoe-t7zje"</w:instrText>
-      </w:r>
-      <w:r>
-        <w:fldChar w:fldCharType="separate"/>
-      </w:r>
-      <w:r>
-        <w:rPr>
-          <w:rStyle w:val="Hyperlink"/>
-          <w:b/>
-          <w:bCs/>
+          <w:b/>
+          <w:bCs/>
+          <w:noProof/>
         </w:rPr>
         <w:drawing>
           <wp:inline distT="0" distB="0" distL="0" distR="0" wp14:anchorId="0F7D2B05" wp14:editId="68B028E2">
             <wp:extent cx="2377440" cy="1341120"/>
             <wp:effectExtent l="0" t="0" r="3810" b="0"/>
             <wp:docPr id="867034217" name="Picture 41" descr="Rest API Versioning - with Spring 7/Spring Boot 4">
-              <a:hlinkClick xmlns:a="http://schemas.openxmlformats.org/drawingml/2006/main" r:id="rId30"/>
+              <a:hlinkClick xmlns:a="http://schemas.openxmlformats.org/drawingml/2006/main" r:id="rId31"/>
             </wp:docPr>
             <wp:cNvGraphicFramePr>
               <a:graphicFrameLocks xmlns:a="http://schemas.openxmlformats.org/drawingml/2006/main" noChangeAspect="1"/>
@@ -3894,14 +3031,14 @@
                 <pic:pic xmlns:pic="http://schemas.openxmlformats.org/drawingml/2006/picture">
                   <pic:nvPicPr>
                     <pic:cNvPr id="0" name="Picture 150" descr="Rest API Versioning - with Spring 7/Spring Boot 4">
-                      <a:hlinkClick r:id="rId30"/>
+                      <a:hlinkClick r:id="rId31"/>
                     </pic:cNvPr>
                     <pic:cNvPicPr>
                       <a:picLocks noChangeAspect="1" noChangeArrowheads="1"/>
                     </pic:cNvPicPr>
                   </pic:nvPicPr>
                   <pic:blipFill>
-                    <a:blip r:embed="rId31">
+                    <a:blip r:embed="rId32">
                       <a:extLst>
                         <a:ext uri="{28A0092B-C50C-407E-A947-70E740481C1C}">
                           <a14:useLocalDpi xmlns:a14="http://schemas.microsoft.com/office/drawing/2010/main" val="0"/>
@@ -3958,21 +3095,7 @@
         <w:rPr>
           <w:rStyle w:val="Hyperlink"/>
         </w:rPr>
-        <w:t xml:space="preserve">Mike </w:t>
-      </w:r>
-      <w:proofErr w:type="gramStart"/>
-      <w:r>
-        <w:rPr>
-          <w:rStyle w:val="Hyperlink"/>
-        </w:rPr>
-        <w:t>Lythgoe  1</w:t>
-      </w:r>
-      <w:proofErr w:type="gramEnd"/>
-      <w:r>
-        <w:rPr>
-          <w:rStyle w:val="Hyperlink"/>
-        </w:rPr>
-        <w:t xml:space="preserve"> month ago</w:t>
+        <w:t>Mike Lythgoe  1 month ago</w:t>
       </w:r>
     </w:p>
     <w:p>
@@ -4037,15 +3160,7 @@
     </w:p>
     <w:p>
       <w:r>
-        <w:t xml:space="preserve">public class </w:t>
-      </w:r>
-      <w:proofErr w:type="spellStart"/>
-      <w:r>
-        <w:t>ProductController</w:t>
-      </w:r>
-      <w:proofErr w:type="spellEnd"/>
-      <w:r>
-        <w:t xml:space="preserve"> {</w:t>
+        <w:t>public class ProductController {</w:t>
       </w:r>
     </w:p>
     <w:p/>
@@ -4056,49 +3171,12 @@
     </w:p>
     <w:p>
       <w:r>
-        <w:t xml:space="preserve">    public String </w:t>
-      </w:r>
-      <w:proofErr w:type="spellStart"/>
-      <w:proofErr w:type="gramStart"/>
-      <w:r>
-        <w:t>getProducts</w:t>
-      </w:r>
-      <w:proofErr w:type="spellEnd"/>
-      <w:r>
-        <w:t>(</w:t>
-      </w:r>
-      <w:proofErr w:type="gramEnd"/>
-      <w:r>
-        <w:t>@</w:t>
-      </w:r>
-      <w:proofErr w:type="gramStart"/>
-      <w:r>
-        <w:t>RequestHeader(</w:t>
-      </w:r>
-      <w:proofErr w:type="gramEnd"/>
-      <w:r>
-        <w:t xml:space="preserve">value = "X-API-VERSION", </w:t>
-      </w:r>
-      <w:proofErr w:type="spellStart"/>
-      <w:r>
-        <w:t>defaultValue</w:t>
-      </w:r>
-      <w:proofErr w:type="spellEnd"/>
-      <w:r>
-        <w:t xml:space="preserve"> = "1") String version) {</w:t>
-      </w:r>
-    </w:p>
-    <w:p>
-      <w:r>
-        <w:t xml:space="preserve">        if ("2</w:t>
-      </w:r>
-      <w:proofErr w:type="gramStart"/>
-      <w:r>
-        <w:t>".equals</w:t>
-      </w:r>
-      <w:proofErr w:type="gramEnd"/>
-      <w:r>
-        <w:t>(version)) {</w:t>
+        <w:t xml:space="preserve">    public String getProducts(@RequestHeader(value = "X-API-VERSION", defaultValue = "1") String version) {</w:t>
+      </w:r>
+    </w:p>
+    <w:p>
+      <w:r>
+        <w:t xml:space="preserve">        if ("2".equals(version)) {</w:t>
       </w:r>
     </w:p>
     <w:p>
@@ -4159,15 +3237,7 @@
     </w:p>
     <w:p>
       <w:r>
-        <w:t>GET /</w:t>
-      </w:r>
-      <w:proofErr w:type="spellStart"/>
-      <w:r>
-        <w:t>api</w:t>
-      </w:r>
-      <w:proofErr w:type="spellEnd"/>
-      <w:r>
-        <w:t>/products</w:t>
+        <w:t>GET /api/products</w:t>
       </w:r>
     </w:p>
     <w:p>
@@ -4202,15 +3272,7 @@
     </w:p>
     <w:p>
       <w:r>
-        <w:t>GET /</w:t>
-      </w:r>
-      <w:proofErr w:type="spellStart"/>
-      <w:r>
-        <w:t>api</w:t>
-      </w:r>
-      <w:proofErr w:type="spellEnd"/>
-      <w:r>
-        <w:t>/products</w:t>
+        <w:t>GET /api/products</w:t>
       </w:r>
     </w:p>
     <w:p>
@@ -4285,37 +3347,13 @@
     </w:p>
     <w:p>
       <w:r>
-        <w:t xml:space="preserve">public class </w:t>
-      </w:r>
-      <w:proofErr w:type="spellStart"/>
-      <w:r>
-        <w:t>ProductController</w:t>
-      </w:r>
-      <w:proofErr w:type="spellEnd"/>
-      <w:r>
-        <w:t xml:space="preserve"> {</w:t>
+        <w:t>public class ProductController {</w:t>
       </w:r>
     </w:p>
     <w:p/>
     <w:p>
       <w:r>
-        <w:t>@</w:t>
-      </w:r>
-      <w:proofErr w:type="gramStart"/>
-      <w:r>
-        <w:t>GetMapping(</w:t>
-      </w:r>
-      <w:proofErr w:type="gramEnd"/>
-      <w:r>
-        <w:t>produces = "</w:t>
-      </w:r>
-      <w:proofErr w:type="gramStart"/>
-      <w:r>
-        <w:t>application/vnd.myapp.v</w:t>
-      </w:r>
-      <w:proofErr w:type="gramEnd"/>
-      <w:r>
-        <w:t>1+json")</w:t>
+        <w:t>@GetMapping(produces = "application/vnd.myapp.v1+json")</w:t>
       </w:r>
     </w:p>
     <w:p>
@@ -4335,23 +3373,7 @@
     </w:p>
     <w:p>
       <w:r>
-        <w:t xml:space="preserve">    @</w:t>
-      </w:r>
-      <w:proofErr w:type="gramStart"/>
-      <w:r>
-        <w:t>GetMapping(</w:t>
-      </w:r>
-      <w:proofErr w:type="gramEnd"/>
-      <w:r>
-        <w:t>produces = "</w:t>
-      </w:r>
-      <w:proofErr w:type="gramStart"/>
-      <w:r>
-        <w:t>application/vnd.myapp.v</w:t>
-      </w:r>
-      <w:proofErr w:type="gramEnd"/>
-      <w:r>
-        <w:t>2+json")</w:t>
+        <w:t xml:space="preserve">    @GetMapping(produces = "application/vnd.myapp.v2+json")</w:t>
       </w:r>
     </w:p>
     <w:p>
@@ -4412,28 +3434,12 @@
     </w:p>
     <w:p>
       <w:r>
-        <w:t>GET /</w:t>
-      </w:r>
-      <w:proofErr w:type="spellStart"/>
-      <w:r>
-        <w:t>api</w:t>
-      </w:r>
-      <w:proofErr w:type="spellEnd"/>
-      <w:r>
-        <w:t>/products</w:t>
-      </w:r>
-    </w:p>
-    <w:p>
-      <w:r>
-        <w:t xml:space="preserve">Accept: </w:t>
-      </w:r>
-      <w:proofErr w:type="gramStart"/>
-      <w:r>
-        <w:t>application/vnd.myapp.v</w:t>
-      </w:r>
-      <w:proofErr w:type="gramEnd"/>
-      <w:r>
-        <w:t xml:space="preserve">1+json        </w:t>
+        <w:t>GET /api/products</w:t>
+      </w:r>
+    </w:p>
+    <w:p>
+      <w:r>
+        <w:t xml:space="preserve">Accept: application/vnd.myapp.v1+json        </w:t>
       </w:r>
     </w:p>
     <w:p>
@@ -4453,28 +3459,12 @@
     </w:p>
     <w:p>
       <w:r>
-        <w:t>GET /</w:t>
-      </w:r>
-      <w:proofErr w:type="spellStart"/>
-      <w:r>
-        <w:t>api</w:t>
-      </w:r>
-      <w:proofErr w:type="spellEnd"/>
-      <w:r>
-        <w:t>/products</w:t>
-      </w:r>
-    </w:p>
-    <w:p>
-      <w:r>
-        <w:t xml:space="preserve">Accept: </w:t>
-      </w:r>
-      <w:proofErr w:type="gramStart"/>
-      <w:r>
-        <w:t>application/vnd.myapp.v</w:t>
-      </w:r>
-      <w:proofErr w:type="gramEnd"/>
-      <w:r>
-        <w:t xml:space="preserve">2+json        </w:t>
+        <w:t>GET /api/products</w:t>
+      </w:r>
+    </w:p>
+    <w:p>
+      <w:r>
+        <w:t xml:space="preserve">Accept: application/vnd.myapp.v2+json        </w:t>
       </w:r>
     </w:p>
     <w:p>
@@ -4583,23 +3573,7 @@
           <w:b/>
           <w:bCs/>
         </w:rPr>
-        <w:t>Swagger (</w:t>
-      </w:r>
-      <w:proofErr w:type="spellStart"/>
-      <w:r>
-        <w:rPr>
-          <w:b/>
-          <w:bCs/>
-        </w:rPr>
-        <w:t>OpenAPI</w:t>
-      </w:r>
-      <w:proofErr w:type="spellEnd"/>
-      <w:r>
-        <w:rPr>
-          <w:b/>
-          <w:bCs/>
-        </w:rPr>
-        <w:t>)</w:t>
+        <w:t>Swagger (OpenAPI)</w:t>
       </w:r>
       <w:r>
         <w:t>:</w:t>
@@ -4624,52 +3598,19 @@
         </w:numPr>
       </w:pPr>
       <w:r>
-        <w:t xml:space="preserve">Use tools like </w:t>
-      </w:r>
-      <w:proofErr w:type="spellStart"/>
-      <w:r>
-        <w:t>SpringDoc</w:t>
-      </w:r>
-      <w:proofErr w:type="spellEnd"/>
-      <w:r>
-        <w:t xml:space="preserve"> </w:t>
-      </w:r>
-      <w:proofErr w:type="spellStart"/>
-      <w:r>
-        <w:t>OpenAPI</w:t>
-      </w:r>
-      <w:proofErr w:type="spellEnd"/>
-      <w:r>
-        <w:t xml:space="preserve"> for automatic documentation.</w:t>
-      </w:r>
-    </w:p>
-    <w:p>
-      <w:r>
-        <w:rPr>
-          <w:b/>
-          <w:bCs/>
-        </w:rPr>
-        <w:t xml:space="preserve">5. Consider </w:t>
-      </w:r>
-      <w:proofErr w:type="spellStart"/>
-      <w:r>
-        <w:rPr>
-          <w:b/>
-          <w:bCs/>
-        </w:rPr>
-        <w:t>GraphQL</w:t>
-      </w:r>
-      <w:proofErr w:type="spellEnd"/>
-      <w:r>
-        <w:t xml:space="preserve"> — If versioning becomes too complex, </w:t>
-      </w:r>
-      <w:proofErr w:type="spellStart"/>
-      <w:r>
-        <w:t>GraphQL</w:t>
-      </w:r>
-      <w:proofErr w:type="spellEnd"/>
-      <w:r>
-        <w:t xml:space="preserve"> might be a better alternative to REST.</w:t>
+        <w:t>Use tools like SpringDoc OpenAPI for automatic documentation.</w:t>
+      </w:r>
+    </w:p>
+    <w:p>
+      <w:r>
+        <w:rPr>
+          <w:b/>
+          <w:bCs/>
+        </w:rPr>
+        <w:t>5. Consider GraphQL</w:t>
+      </w:r>
+      <w:r>
+        <w:t> — If versioning becomes too complex, GraphQL might be a better alternative to REST.</w:t>
       </w:r>
     </w:p>
     <w:p>
@@ -4719,26 +3660,12 @@
     <w:p/>
     <w:p/>
     <w:p>
-      <w:hyperlink r:id="rId32" w:history="1">
+      <w:hyperlink r:id="rId33" w:history="1">
         <w:r>
           <w:rPr>
             <w:rStyle w:val="Hyperlink"/>
           </w:rPr>
-          <w:t xml:space="preserve">REST API Design: What is Idempotency? | by </w:t>
-        </w:r>
-        <w:proofErr w:type="spellStart"/>
-        <w:r>
-          <w:rPr>
-            <w:rStyle w:val="Hyperlink"/>
-          </w:rPr>
-          <w:t>Reetesh</w:t>
-        </w:r>
-        <w:proofErr w:type="spellEnd"/>
-        <w:r>
-          <w:rPr>
-            <w:rStyle w:val="Hyperlink"/>
-          </w:rPr>
-          <w:t xml:space="preserve"> Kumar | Medium</w:t>
+          <w:t>REST API Design: What is Idempotency? | by Reetesh Kumar | Medium</w:t>
         </w:r>
       </w:hyperlink>
     </w:p>
@@ -4782,13 +3709,14 @@
       <w:r>
         <w:rPr>
           <w:rStyle w:val="Hyperlink"/>
+          <w:noProof/>
         </w:rPr>
         <w:drawing>
           <wp:inline distT="0" distB="0" distL="0" distR="0" wp14:anchorId="10A292CE" wp14:editId="084DD800">
             <wp:extent cx="304800" cy="304800"/>
             <wp:effectExtent l="0" t="0" r="0" b="0"/>
             <wp:docPr id="993955648" name="Picture 6" descr="Reetesh Kumar">
-              <a:hlinkClick xmlns:a="http://schemas.openxmlformats.org/drawingml/2006/main" r:id="rId33"/>
+              <a:hlinkClick xmlns:a="http://schemas.openxmlformats.org/drawingml/2006/main" r:id="rId34"/>
             </wp:docPr>
             <wp:cNvGraphicFramePr>
               <a:graphicFrameLocks xmlns:a="http://schemas.openxmlformats.org/drawingml/2006/main" noChangeAspect="1"/>
@@ -4798,14 +3726,14 @@
                 <pic:pic xmlns:pic="http://schemas.openxmlformats.org/drawingml/2006/picture">
                   <pic:nvPicPr>
                     <pic:cNvPr id="0" name="Picture 16" descr="Reetesh Kumar">
-                      <a:hlinkClick r:id="rId33"/>
+                      <a:hlinkClick r:id="rId34"/>
                     </pic:cNvPr>
                     <pic:cNvPicPr>
                       <a:picLocks noChangeAspect="1" noChangeArrowheads="1"/>
                     </pic:cNvPicPr>
                   </pic:nvPicPr>
                   <pic:blipFill>
-                    <a:blip r:embed="rId34">
+                    <a:blip r:embed="rId35">
                       <a:extLst>
                         <a:ext uri="{28A0092B-C50C-407E-A947-70E740481C1C}">
                           <a14:useLocalDpi xmlns:a14="http://schemas.microsoft.com/office/drawing/2010/main" val="0"/>
@@ -4843,20 +3771,12 @@
       </w:r>
     </w:p>
     <w:p>
-      <w:hyperlink r:id="rId35" w:history="1">
-        <w:proofErr w:type="spellStart"/>
+      <w:hyperlink r:id="rId36" w:history="1">
         <w:r>
           <w:rPr>
             <w:rStyle w:val="Hyperlink"/>
           </w:rPr>
-          <w:t>Reetesh</w:t>
-        </w:r>
-        <w:proofErr w:type="spellEnd"/>
-        <w:r>
-          <w:rPr>
-            <w:rStyle w:val="Hyperlink"/>
-          </w:rPr>
-          <w:t xml:space="preserve"> Kumar</w:t>
+          <w:t>Reetesh Kumar</w:t>
         </w:r>
       </w:hyperlink>
     </w:p>
@@ -4918,6 +3838,9 @@
     </w:p>
     <w:p>
       <w:r>
+        <w:rPr>
+          <w:noProof/>
+        </w:rPr>
         <w:lastRenderedPageBreak/>
         <w:drawing>
           <wp:inline distT="0" distB="0" distL="0" distR="0" wp14:anchorId="47E6A873" wp14:editId="0256301E">
@@ -4937,7 +3860,7 @@
                     </pic:cNvPicPr>
                   </pic:nvPicPr>
                   <pic:blipFill>
-                    <a:blip r:embed="rId36">
+                    <a:blip r:embed="rId37">
                       <a:extLst>
                         <a:ext uri="{28A0092B-C50C-407E-A947-70E740481C1C}">
                           <a14:useLocalDpi xmlns:a14="http://schemas.microsoft.com/office/drawing/2010/main" val="0"/>
@@ -5046,15 +3969,7 @@
         <w:t>Endpoint:</w:t>
       </w:r>
       <w:r>
-        <w:t> PUT /users/{</w:t>
-      </w:r>
-      <w:proofErr w:type="spellStart"/>
-      <w:r>
-        <w:t>userId</w:t>
-      </w:r>
-      <w:proofErr w:type="spellEnd"/>
-      <w:r>
-        <w:t>}/email</w:t>
+        <w:t> PUT /users/{userId}/email</w:t>
       </w:r>
     </w:p>
     <w:p>
@@ -5066,21 +3981,8 @@
         <w:t>Payload:</w:t>
       </w:r>
       <w:r>
-        <w:t> </w:t>
-      </w:r>
-      <w:proofErr w:type="gramStart"/>
-      <w:r>
-        <w:t>{ “</w:t>
-      </w:r>
-      <w:proofErr w:type="gramEnd"/>
-      <w:r>
-        <w:t>email”: “user@example.com</w:t>
-      </w:r>
-      <w:proofErr w:type="gramStart"/>
-      <w:r>
-        <w:t>” }</w:t>
-      </w:r>
-      <w:proofErr w:type="gramEnd"/>
+        <w:t> { “email”: “user@example.com” }</w:t>
+      </w:r>
     </w:p>
     <w:p>
       <w:r>
@@ -5091,15 +3993,7 @@
         <w:t>Initial Request:</w:t>
       </w:r>
       <w:r>
-        <w:t xml:space="preserve"> A client application sends a PUT request to update the email address of a user with </w:t>
-      </w:r>
-      <w:proofErr w:type="spellStart"/>
-      <w:r>
-        <w:t>userId</w:t>
-      </w:r>
-      <w:proofErr w:type="spellEnd"/>
-      <w:r>
-        <w:t xml:space="preserve"> 1234 to “user@example.com”:</w:t>
+        <w:t> A client application sends a PUT request to update the email address of a user with userId 1234 to “user@example.com”:</w:t>
       </w:r>
     </w:p>
     <w:p>
@@ -5108,13 +4002,8 @@
       </w:r>
       <w:r>
         <w:br/>
-        <w:t>Content-Type: application/</w:t>
-      </w:r>
-      <w:proofErr w:type="spellStart"/>
-      <w:r>
-        <w:t>json</w:t>
-      </w:r>
-      <w:proofErr w:type="spellEnd"/>
+        <w:t>Content-Type: application/json</w:t>
+      </w:r>
       <w:r>
         <w:br/>
       </w:r>
@@ -5154,13 +4043,8 @@
       </w:r>
       <w:r>
         <w:br/>
-        <w:t>Content-Type: application/</w:t>
-      </w:r>
-      <w:proofErr w:type="spellStart"/>
-      <w:r>
-        <w:t>json</w:t>
-      </w:r>
-      <w:proofErr w:type="spellEnd"/>
+        <w:t>Content-Type: application/json</w:t>
+      </w:r>
       <w:r>
         <w:br/>
       </w:r>
@@ -5328,15 +4212,7 @@
         <w:t>Supports Concurrency: </w:t>
       </w:r>
       <w:r>
-        <w:t xml:space="preserve">In systems </w:t>
-      </w:r>
-      <w:proofErr w:type="gramStart"/>
-      <w:r>
-        <w:t>where</w:t>
-      </w:r>
-      <w:proofErr w:type="gramEnd"/>
-      <w:r>
-        <w:t xml:space="preserve"> multiple clients might attempt to modify the same resource simultaneously, idempotency helps manage concurrency. It ensures that concurrent operations can be executed without </w:t>
+        <w:t xml:space="preserve">In systems where multiple clients might attempt to modify the same resource simultaneously, idempotency helps manage concurrency. It ensures that concurrent operations can be executed without </w:t>
       </w:r>
       <w:r>
         <w:lastRenderedPageBreak/>
@@ -5515,6 +4391,9 @@
     </w:p>
     <w:p>
       <w:r>
+        <w:rPr>
+          <w:noProof/>
+        </w:rPr>
         <mc:AlternateContent>
           <mc:Choice Requires="wps">
             <w:drawing>
@@ -5522,7 +4401,7 @@
                 <wp:extent cx="304800" cy="304800"/>
                 <wp:effectExtent l="0" t="0" r="0" b="0"/>
                 <wp:docPr id="1503460450" name="Rectangle 4" descr="Subscribe to the Medium newsletter">
-                  <a:hlinkClick xmlns:a="http://schemas.openxmlformats.org/drawingml/2006/main" r:id="rId37"/>
+                  <a:hlinkClick xmlns:a="http://schemas.openxmlformats.org/drawingml/2006/main" r:id="rId38"/>
                 </wp:docPr>
                 <wp:cNvGraphicFramePr>
                   <a:graphicFrameLocks xmlns:a="http://schemas.openxmlformats.org/drawingml/2006/main" noChangeAspect="1"/>
@@ -5604,13 +4483,8 @@
       </w:r>
       <w:r>
         <w:br/>
-        <w:t>Content-Type: application/</w:t>
-      </w:r>
-      <w:proofErr w:type="spellStart"/>
-      <w:r>
-        <w:t>json</w:t>
-      </w:r>
-      <w:proofErr w:type="spellEnd"/>
+        <w:t>Content-Type: application/json</w:t>
+      </w:r>
       <w:r>
         <w:br/>
         <w:t>Idempotency-Key: 123e4567-e89b-12d3-a456-426614174000</w:t>
@@ -5657,15 +4531,7 @@
     </w:p>
     <w:p>
       <w:r>
-        <w:t xml:space="preserve">Use HTTP methods according to their defined idempotent characteristics. For example, GET, PUT, and DELETE </w:t>
-      </w:r>
-      <w:proofErr w:type="gramStart"/>
-      <w:r>
-        <w:t>are</w:t>
-      </w:r>
-      <w:proofErr w:type="gramEnd"/>
-      <w:r>
-        <w:t xml:space="preserve"> inherently idempotent.</w:t>
+        <w:t>Use HTTP methods according to their defined idempotent characteristics. For example, GET, PUT, and DELETE are inherently idempotent.</w:t>
       </w:r>
     </w:p>
     <w:p>
@@ -5743,15 +4609,7 @@
       </w:r>
       <w:r>
         <w:br/>
-        <w:t xml:space="preserve">WHERE id = 123 AND </w:t>
-      </w:r>
-      <w:proofErr w:type="gramStart"/>
-      <w:r>
-        <w:t>email !</w:t>
-      </w:r>
-      <w:proofErr w:type="gramEnd"/>
-      <w:r>
-        <w:t>= 'new@example.com';</w:t>
+        <w:t>WHERE id = 123 AND email != 'new@example.com';</w:t>
       </w:r>
     </w:p>
     <w:p>
@@ -5846,23 +4704,7 @@
           <w:b/>
           <w:bCs/>
         </w:rPr>
-        <w:t xml:space="preserve">Idempotent vs. Safe Methods </w:t>
-      </w:r>
-      <w:proofErr w:type="gramStart"/>
-      <w:r>
-        <w:rPr>
-          <w:b/>
-          <w:bCs/>
-        </w:rPr>
-        <w:t>In</w:t>
-      </w:r>
-      <w:proofErr w:type="gramEnd"/>
-      <w:r>
-        <w:rPr>
-          <w:b/>
-          <w:bCs/>
-        </w:rPr>
-        <w:t xml:space="preserve"> REST API</w:t>
+        <w:t>Idempotent vs. Safe Methods In REST API</w:t>
       </w:r>
     </w:p>
     <w:p>
@@ -6100,33 +4942,20 @@
     </w:p>
     <w:p>
       <w:r>
-        <w:t xml:space="preserve">Happy </w:t>
-      </w:r>
-      <w:proofErr w:type="gramStart"/>
-      <w:r>
-        <w:t>Learning !!!</w:t>
-      </w:r>
-      <w:proofErr w:type="gramEnd"/>
+        <w:t>Happy Learning !!!</w:t>
+      </w:r>
     </w:p>
     <w:p/>
     <w:p/>
     <w:p/>
     <w:p>
-      <w:hyperlink r:id="rId38" w:history="1">
+      <w:hyperlink r:id="rId39" w:history="1">
         <w:r>
           <w:rPr>
             <w:rStyle w:val="Hyperlink"/>
           </w:rPr>
-          <w:t xml:space="preserve">Idempotency in Spring Microservices | </w:t>
+          <w:t>Idempotency in Spring Microservices | Stackademic</w:t>
         </w:r>
-        <w:proofErr w:type="spellStart"/>
-        <w:r>
-          <w:rPr>
-            <w:rStyle w:val="Hyperlink"/>
-          </w:rPr>
-          <w:t>Stackademic</w:t>
-        </w:r>
-        <w:proofErr w:type="spellEnd"/>
       </w:hyperlink>
     </w:p>
     <w:p>
@@ -6169,13 +4998,14 @@
       <w:r>
         <w:rPr>
           <w:rStyle w:val="Hyperlink"/>
+          <w:noProof/>
         </w:rPr>
         <w:drawing>
           <wp:inline distT="0" distB="0" distL="0" distR="0" wp14:anchorId="7BDBFA98" wp14:editId="330150CE">
             <wp:extent cx="302260" cy="302260"/>
             <wp:effectExtent l="0" t="0" r="2540" b="2540"/>
             <wp:docPr id="1957441498" name="Picture 12" descr="Alexander Obregon">
-              <a:hlinkClick xmlns:a="http://schemas.openxmlformats.org/drawingml/2006/main" r:id="rId39"/>
+              <a:hlinkClick xmlns:a="http://schemas.openxmlformats.org/drawingml/2006/main" r:id="rId40"/>
             </wp:docPr>
             <wp:cNvGraphicFramePr>
               <a:graphicFrameLocks xmlns:a="http://schemas.openxmlformats.org/drawingml/2006/main" noChangeAspect="1"/>
@@ -6185,14 +5015,14 @@
                 <pic:pic xmlns:pic="http://schemas.openxmlformats.org/drawingml/2006/picture">
                   <pic:nvPicPr>
                     <pic:cNvPr id="0" name="Picture 37" descr="Alexander Obregon">
-                      <a:hlinkClick r:id="rId39"/>
+                      <a:hlinkClick r:id="rId40"/>
                     </pic:cNvPr>
                     <pic:cNvPicPr>
                       <a:picLocks noChangeAspect="1" noChangeArrowheads="1"/>
                     </pic:cNvPicPr>
                   </pic:nvPicPr>
                   <pic:blipFill>
-                    <a:blip r:embed="rId40">
+                    <a:blip r:embed="rId41">
                       <a:extLst>
                         <a:ext uri="{28A0092B-C50C-407E-A947-70E740481C1C}">
                           <a14:useLocalDpi xmlns:a14="http://schemas.microsoft.com/office/drawing/2010/main" val="0"/>
@@ -6230,7 +5060,7 @@
       </w:r>
     </w:p>
     <w:p>
-      <w:hyperlink r:id="rId41" w:history="1">
+      <w:hyperlink r:id="rId42" w:history="1">
         <w:r>
           <w:rPr>
             <w:rStyle w:val="Hyperlink"/>
@@ -6287,6 +5117,9 @@
     </w:p>
     <w:p>
       <w:r>
+        <w:rPr>
+          <w:noProof/>
+        </w:rPr>
         <w:lastRenderedPageBreak/>
         <w:drawing>
           <wp:inline distT="0" distB="0" distL="0" distR="0" wp14:anchorId="412985A4" wp14:editId="0E7C2166">
@@ -6306,7 +5139,7 @@
                     </pic:cNvPicPr>
                   </pic:nvPicPr>
                   <pic:blipFill>
-                    <a:blip r:embed="rId42">
+                    <a:blip r:embed="rId43">
                       <a:extLst>
                         <a:ext uri="{28A0092B-C50C-407E-A947-70E740481C1C}">
                           <a14:useLocalDpi xmlns:a14="http://schemas.microsoft.com/office/drawing/2010/main" val="0"/>
@@ -6339,7 +5172,7 @@
       </w:r>
     </w:p>
     <w:p>
-      <w:hyperlink r:id="rId43" w:tgtFrame="_blank" w:history="1">
+      <w:hyperlink r:id="rId44" w:tgtFrame="_blank" w:history="1">
         <w:r>
           <w:rPr>
             <w:rStyle w:val="Hyperlink"/>
@@ -6600,15 +5433,7 @@
     </w:p>
     <w:p>
       <w:r>
-        <w:t xml:space="preserve">For end-users, system </w:t>
-      </w:r>
-      <w:proofErr w:type="spellStart"/>
-      <w:r>
-        <w:t>behaviors</w:t>
-      </w:r>
-      <w:proofErr w:type="spellEnd"/>
-      <w:r>
-        <w:t xml:space="preserve"> should be predictable and trustworthy. If a user submits a form and faces a timeout, they should be confident in resubmitting without worrying about unintended side effects. Idempotency offers this confidence. It ensures that even if users repeat actions due to UI glitches, network issues, or just plain impatience, the system behaves in a consistent and expected manner.</w:t>
+        <w:t>For end-users, system behaviors should be predictable and trustworthy. If a user submits a form and faces a timeout, they should be confident in resubmitting without worrying about unintended side effects. Idempotency offers this confidence. It ensures that even if users repeat actions due to UI glitches, network issues, or just plain impatience, the system behaves in a consistent and expected manner.</w:t>
       </w:r>
     </w:p>
     <w:p>
@@ -6682,6 +5507,9 @@
     </w:p>
     <w:p>
       <w:r>
+        <w:rPr>
+          <w:noProof/>
+        </w:rPr>
         <mc:AlternateContent>
           <mc:Choice Requires="wps">
             <w:drawing>
@@ -6689,7 +5517,7 @@
                 <wp:extent cx="302260" cy="302260"/>
                 <wp:effectExtent l="0" t="0" r="0" b="0"/>
                 <wp:docPr id="2095904534" name="Rectangle 10" descr="Become a Medium member">
-                  <a:hlinkClick xmlns:a="http://schemas.openxmlformats.org/drawingml/2006/main" r:id="rId44"/>
+                  <a:hlinkClick xmlns:a="http://schemas.openxmlformats.org/drawingml/2006/main" r:id="rId45"/>
                 </wp:docPr>
                 <wp:cNvGraphicFramePr>
                   <a:graphicFrameLocks xmlns:a="http://schemas.openxmlformats.org/drawingml/2006/main" noChangeAspect="1"/>
@@ -6768,15 +5596,7 @@
       </w:r>
       <w:r>
         <w:br/>
-        <w:t xml:space="preserve">public class </w:t>
-      </w:r>
-      <w:proofErr w:type="spellStart"/>
-      <w:r>
-        <w:t>OrderController</w:t>
-      </w:r>
-      <w:proofErr w:type="spellEnd"/>
-      <w:r>
-        <w:t xml:space="preserve"> {</w:t>
+        <w:t>public class OrderController {</w:t>
       </w:r>
       <w:r>
         <w:br/>
@@ -6787,31 +5607,7 @@
       </w:r>
       <w:r>
         <w:br/>
-        <w:t xml:space="preserve">    private final Map&lt;String, </w:t>
-      </w:r>
-      <w:proofErr w:type="spellStart"/>
-      <w:r>
-        <w:t>OrderResponse</w:t>
-      </w:r>
-      <w:proofErr w:type="spellEnd"/>
-      <w:r>
-        <w:t xml:space="preserve">&gt; </w:t>
-      </w:r>
-      <w:proofErr w:type="spellStart"/>
-      <w:r>
-        <w:t>idempotencyStore</w:t>
-      </w:r>
-      <w:proofErr w:type="spellEnd"/>
-      <w:r>
-        <w:t xml:space="preserve"> = new </w:t>
-      </w:r>
-      <w:proofErr w:type="spellStart"/>
-      <w:r>
-        <w:t>ConcurrentHashMap</w:t>
-      </w:r>
-      <w:proofErr w:type="spellEnd"/>
-      <w:r>
-        <w:t>&lt;&gt;();</w:t>
+        <w:t xml:space="preserve">    private final Map&lt;String, OrderResponse&gt; idempotencyStore = new ConcurrentHashMap&lt;&gt;();</w:t>
       </w:r>
       <w:r>
         <w:br/>
@@ -6822,102 +5618,22 @@
       </w:r>
       <w:r>
         <w:br/>
-        <w:t xml:space="preserve">    public </w:t>
-      </w:r>
-      <w:proofErr w:type="spellStart"/>
-      <w:r>
-        <w:t>ResponseEntity</w:t>
-      </w:r>
-      <w:proofErr w:type="spellEnd"/>
-      <w:r>
-        <w:t>&lt;</w:t>
-      </w:r>
-      <w:proofErr w:type="spellStart"/>
-      <w:r>
-        <w:t>OrderResponse</w:t>
-      </w:r>
-      <w:proofErr w:type="spellEnd"/>
-      <w:r>
-        <w:t xml:space="preserve">&gt; </w:t>
-      </w:r>
-      <w:proofErr w:type="spellStart"/>
-      <w:r>
-        <w:t>placeOrder</w:t>
-      </w:r>
-      <w:proofErr w:type="spellEnd"/>
-      <w:r>
-        <w:t xml:space="preserve">(@RequestBody </w:t>
-      </w:r>
-      <w:proofErr w:type="spellStart"/>
-      <w:r>
-        <w:t>OrderRequest</w:t>
-      </w:r>
-      <w:proofErr w:type="spellEnd"/>
-      <w:r>
-        <w:t xml:space="preserve"> request,</w:t>
-      </w:r>
-      <w:r>
-        <w:br/>
-        <w:t xml:space="preserve">                                                   @RequestHeader("Idempotency-Key") String </w:t>
-      </w:r>
-      <w:proofErr w:type="spellStart"/>
-      <w:r>
-        <w:t>idempotencyKey</w:t>
-      </w:r>
-      <w:proofErr w:type="spellEnd"/>
-      <w:r>
-        <w:t>) {</w:t>
-      </w:r>
-      <w:r>
-        <w:br/>
-        <w:t xml:space="preserve">        if (</w:t>
-      </w:r>
-      <w:proofErr w:type="spellStart"/>
-      <w:r>
-        <w:t>idempotencyStore.containsKey</w:t>
-      </w:r>
-      <w:proofErr w:type="spellEnd"/>
-      <w:r>
-        <w:t>(</w:t>
-      </w:r>
-      <w:proofErr w:type="spellStart"/>
-      <w:r>
-        <w:t>idempotencyKey</w:t>
-      </w:r>
-      <w:proofErr w:type="spellEnd"/>
-      <w:r>
-        <w:t>)) {</w:t>
+        <w:t xml:space="preserve">    public ResponseEntity&lt;OrderResponse&gt; placeOrder(@RequestBody OrderRequest request,</w:t>
+      </w:r>
+      <w:r>
+        <w:br/>
+        <w:t xml:space="preserve">                                                   @RequestHeader("Idempotency-Key") String idempotencyKey) {</w:t>
+      </w:r>
+      <w:r>
+        <w:br/>
+        <w:t xml:space="preserve">        if (idempotencyStore.containsKey(idempotencyKey)) {</w:t>
       </w:r>
       <w:r>
         <w:br/>
       </w:r>
       <w:r>
         <w:lastRenderedPageBreak/>
-        <w:t xml:space="preserve">            return </w:t>
-      </w:r>
-      <w:proofErr w:type="spellStart"/>
-      <w:r>
-        <w:t>ResponseEntity.ok</w:t>
-      </w:r>
-      <w:proofErr w:type="spellEnd"/>
-      <w:r>
-        <w:t>(</w:t>
-      </w:r>
-      <w:proofErr w:type="spellStart"/>
-      <w:r>
-        <w:t>idempotencyStore.get</w:t>
-      </w:r>
-      <w:proofErr w:type="spellEnd"/>
-      <w:r>
-        <w:t>(</w:t>
-      </w:r>
-      <w:proofErr w:type="spellStart"/>
-      <w:r>
-        <w:t>idempotencyKey</w:t>
-      </w:r>
-      <w:proofErr w:type="spellEnd"/>
-      <w:r>
-        <w:t>));</w:t>
+        <w:t xml:space="preserve">            return ResponseEntity.ok(idempotencyStore.get(idempotencyKey));</w:t>
       </w:r>
       <w:r>
         <w:br/>
@@ -6932,58 +5648,18 @@
       </w:r>
       <w:r>
         <w:br/>
-        <w:t xml:space="preserve">        </w:t>
-      </w:r>
-      <w:proofErr w:type="spellStart"/>
-      <w:r>
-        <w:t>OrderResponse</w:t>
-      </w:r>
-      <w:proofErr w:type="spellEnd"/>
-      <w:r>
-        <w:t xml:space="preserve"> response = new </w:t>
-      </w:r>
-      <w:proofErr w:type="spellStart"/>
-      <w:r>
-        <w:t>OrderResponse</w:t>
-      </w:r>
-      <w:proofErr w:type="spellEnd"/>
-      <w:r>
-        <w:t>(/*...*/);</w:t>
-      </w:r>
-      <w:r>
-        <w:br/>
-      </w:r>
-      <w:r>
-        <w:br/>
-        <w:t xml:space="preserve">        </w:t>
-      </w:r>
-      <w:proofErr w:type="spellStart"/>
-      <w:r>
-        <w:t>idempotencyStore.put</w:t>
-      </w:r>
-      <w:proofErr w:type="spellEnd"/>
-      <w:r>
-        <w:t>(</w:t>
-      </w:r>
-      <w:proofErr w:type="spellStart"/>
-      <w:r>
-        <w:t>idempotencyKey</w:t>
-      </w:r>
-      <w:proofErr w:type="spellEnd"/>
-      <w:r>
-        <w:t>, response);</w:t>
-      </w:r>
-      <w:r>
-        <w:br/>
-        <w:t xml:space="preserve">        return </w:t>
-      </w:r>
-      <w:proofErr w:type="spellStart"/>
-      <w:r>
-        <w:t>ResponseEntity.ok</w:t>
-      </w:r>
-      <w:proofErr w:type="spellEnd"/>
-      <w:r>
-        <w:t>(response);</w:t>
+        <w:t xml:space="preserve">        OrderResponse response = new OrderResponse(/*...*/);</w:t>
+      </w:r>
+      <w:r>
+        <w:br/>
+      </w:r>
+      <w:r>
+        <w:br/>
+        <w:t xml:space="preserve">        idempotencyStore.put(idempotencyKey, response);</w:t>
+      </w:r>
+      <w:r>
+        <w:br/>
+        <w:t xml:space="preserve">        return ResponseEntity.ok(response);</w:t>
       </w:r>
       <w:r>
         <w:br/>
@@ -7011,15 +5687,7 @@
     </w:p>
     <w:p>
       <w:r>
-        <w:t xml:space="preserve">In contexts where operations encompass changes to the database, harnessing the inherent transactional capability of databases can promote idempotency. By marking methods with Spring’s @Transactional annotation, </w:t>
-      </w:r>
-      <w:proofErr w:type="gramStart"/>
-      <w:r>
-        <w:t>you</w:t>
-      </w:r>
-      <w:proofErr w:type="gramEnd"/>
-      <w:r>
-        <w:t xml:space="preserve"> envelope them within transactional boundaries. This ensures that if a method doesn't execute to completion (perhaps due to a failure), all associated database changes are rolled back, maintaining the data's integrity and consistency.</w:t>
+        <w:t>In contexts where operations encompass changes to the database, harnessing the inherent transactional capability of databases can promote idempotency. By marking methods with Spring’s @Transactional annotation, you envelope them within transactional boundaries. This ensures that if a method doesn't execute to completion (perhaps due to a failure), all associated database changes are rolled back, maintaining the data's integrity and consistency.</w:t>
       </w:r>
     </w:p>
     <w:p>
@@ -7028,15 +5696,7 @@
       </w:r>
       <w:r>
         <w:br/>
-        <w:t xml:space="preserve">public class </w:t>
-      </w:r>
-      <w:proofErr w:type="spellStart"/>
-      <w:r>
-        <w:t>OrderService</w:t>
-      </w:r>
-      <w:proofErr w:type="spellEnd"/>
-      <w:r>
-        <w:t xml:space="preserve"> {</w:t>
+        <w:t>public class OrderService {</w:t>
       </w:r>
       <w:r>
         <w:br/>
@@ -7047,25 +5707,7 @@
       </w:r>
       <w:r>
         <w:br/>
-        <w:t xml:space="preserve">    public Order </w:t>
-      </w:r>
-      <w:proofErr w:type="spellStart"/>
-      <w:proofErr w:type="gramStart"/>
-      <w:r>
-        <w:t>placeOrder</w:t>
-      </w:r>
-      <w:proofErr w:type="spellEnd"/>
-      <w:r>
-        <w:t>(</w:t>
-      </w:r>
-      <w:proofErr w:type="spellStart"/>
-      <w:proofErr w:type="gramEnd"/>
-      <w:r>
-        <w:t>OrderRequest</w:t>
-      </w:r>
-      <w:proofErr w:type="spellEnd"/>
-      <w:r>
-        <w:t xml:space="preserve"> request) {</w:t>
+        <w:t xml:space="preserve">    public Order placeOrder(OrderRequest request) {</w:t>
       </w:r>
       <w:r>
         <w:br/>
@@ -7073,13 +5715,8 @@
       </w:r>
       <w:r>
         <w:br/>
-        <w:t xml:space="preserve">  </w:t>
-      </w:r>
-      <w:proofErr w:type="gramStart"/>
-      <w:r>
-        <w:t xml:space="preserve">  }</w:t>
-      </w:r>
-      <w:proofErr w:type="gramEnd"/>
+        <w:t xml:space="preserve">    }</w:t>
+      </w:r>
       <w:r>
         <w:br/>
         <w:t>}</w:t>
@@ -7111,45 +5748,11 @@
       </w:r>
       <w:r>
         <w:br/>
-        <w:t xml:space="preserve">public </w:t>
-      </w:r>
-      <w:proofErr w:type="spellStart"/>
-      <w:r>
-        <w:t>MetadataStore</w:t>
-      </w:r>
-      <w:proofErr w:type="spellEnd"/>
-      <w:r>
-        <w:t xml:space="preserve"> </w:t>
-      </w:r>
-      <w:proofErr w:type="spellStart"/>
-      <w:proofErr w:type="gramStart"/>
-      <w:r>
-        <w:t>metadataStore</w:t>
-      </w:r>
-      <w:proofErr w:type="spellEnd"/>
-      <w:r>
-        <w:t>(</w:t>
-      </w:r>
-      <w:proofErr w:type="gramEnd"/>
-      <w:r>
-        <w:t>) {</w:t>
-      </w:r>
-      <w:r>
-        <w:br/>
-        <w:t xml:space="preserve">    return new </w:t>
-      </w:r>
-      <w:proofErr w:type="spellStart"/>
-      <w:proofErr w:type="gramStart"/>
-      <w:r>
-        <w:t>SimpleMetadataStore</w:t>
-      </w:r>
-      <w:proofErr w:type="spellEnd"/>
-      <w:r>
-        <w:t>();  /</w:t>
-      </w:r>
-      <w:proofErr w:type="gramEnd"/>
-      <w:r>
-        <w:t>/ This is an in-memory store. For production systems, consider JDBC or Redis-based stores.</w:t>
+        <w:t>public MetadataStore metadataStore() {</w:t>
+      </w:r>
+      <w:r>
+        <w:br/>
+        <w:t xml:space="preserve">    return new SimpleMetadataStore();  // This is an in-memory store. For production systems, consider JDBC or Redis-based stores.</w:t>
       </w:r>
       <w:r>
         <w:br/>
@@ -7164,62 +5767,15 @@
       </w:r>
       <w:r>
         <w:br/>
-        <w:t xml:space="preserve">public </w:t>
-      </w:r>
-      <w:proofErr w:type="spellStart"/>
-      <w:r>
-        <w:t>IdempotentReceiverInterceptor</w:t>
-      </w:r>
-      <w:proofErr w:type="spellEnd"/>
-      <w:r>
-        <w:t xml:space="preserve"> </w:t>
-      </w:r>
-      <w:proofErr w:type="spellStart"/>
-      <w:proofErr w:type="gramStart"/>
-      <w:r>
-        <w:t>idempotentReceiverInterceptor</w:t>
-      </w:r>
-      <w:proofErr w:type="spellEnd"/>
-      <w:r>
-        <w:t>(</w:t>
-      </w:r>
-      <w:proofErr w:type="spellStart"/>
-      <w:proofErr w:type="gramEnd"/>
-      <w:r>
-        <w:t>MetadataStore</w:t>
-      </w:r>
-      <w:proofErr w:type="spellEnd"/>
-      <w:r>
-        <w:t xml:space="preserve"> </w:t>
-      </w:r>
-      <w:proofErr w:type="spellStart"/>
+        <w:t xml:space="preserve">public IdempotentReceiverInterceptor idempotentReceiverInterceptor(MetadataStore </w:t>
+      </w:r>
       <w:r>
         <w:lastRenderedPageBreak/>
-        <w:t>metadataStore</w:t>
-      </w:r>
-      <w:proofErr w:type="spellEnd"/>
-      <w:r>
-        <w:t>) {</w:t>
-      </w:r>
-      <w:r>
-        <w:br/>
-        <w:t xml:space="preserve">    return new </w:t>
-      </w:r>
-      <w:proofErr w:type="spellStart"/>
-      <w:r>
-        <w:t>IdempotentReceiverInterceptor</w:t>
-      </w:r>
-      <w:proofErr w:type="spellEnd"/>
-      <w:r>
-        <w:t>(</w:t>
-      </w:r>
-      <w:proofErr w:type="spellStart"/>
-      <w:r>
-        <w:t>metadataStore</w:t>
-      </w:r>
-      <w:proofErr w:type="spellEnd"/>
-      <w:r>
-        <w:t>);</w:t>
+        <w:t>metadataStore) {</w:t>
+      </w:r>
+      <w:r>
+        <w:br/>
+        <w:t xml:space="preserve">    return new IdempotentReceiverInterceptor(metadataStore);</w:t>
       </w:r>
       <w:r>
         <w:br/>
@@ -7248,60 +5804,15 @@
     </w:p>
     <w:p>
       <w:r>
-        <w:t>@</w:t>
-      </w:r>
-      <w:proofErr w:type="gramStart"/>
-      <w:r>
-        <w:t>Scheduled(</w:t>
-      </w:r>
-      <w:proofErr w:type="gramEnd"/>
-      <w:r>
-        <w:t>fixedRate = 10_000)</w:t>
-      </w:r>
-      <w:r>
-        <w:br/>
-        <w:t>@</w:t>
-      </w:r>
-      <w:proofErr w:type="gramStart"/>
-      <w:r>
-        <w:t>SchedulerLock(</w:t>
-      </w:r>
-      <w:proofErr w:type="gramEnd"/>
-      <w:r>
-        <w:t>name = "</w:t>
-      </w:r>
-      <w:proofErr w:type="spellStart"/>
-      <w:r>
-        <w:t>scheduledTaskName</w:t>
-      </w:r>
-      <w:proofErr w:type="spellEnd"/>
-      <w:r>
-        <w:t xml:space="preserve">", </w:t>
-      </w:r>
-      <w:proofErr w:type="spellStart"/>
-      <w:r>
-        <w:t>lockAtMostFor</w:t>
-      </w:r>
-      <w:proofErr w:type="spellEnd"/>
-      <w:r>
-        <w:t xml:space="preserve"> = "5m")</w:t>
-      </w:r>
-      <w:r>
-        <w:br/>
-        <w:t xml:space="preserve">public void </w:t>
-      </w:r>
-      <w:proofErr w:type="spellStart"/>
-      <w:proofErr w:type="gramStart"/>
-      <w:r>
-        <w:t>scheduledTask</w:t>
-      </w:r>
-      <w:proofErr w:type="spellEnd"/>
-      <w:r>
-        <w:t>(</w:t>
-      </w:r>
-      <w:proofErr w:type="gramEnd"/>
-      <w:r>
-        <w:t>) {</w:t>
+        <w:t>@Scheduled(fixedRate = 10_000)</w:t>
+      </w:r>
+      <w:r>
+        <w:br/>
+        <w:t>@SchedulerLock(name = "scheduledTaskName", lockAtMostFor = "5m")</w:t>
+      </w:r>
+      <w:r>
+        <w:br/>
+        <w:t>public void scheduledTask() {</w:t>
       </w:r>
       <w:r>
         <w:br/>
@@ -7613,15 +6124,7 @@
     </w:p>
     <w:p>
       <w:r>
-        <w:t xml:space="preserve">Over time, the data structure or schema associated with a request might evolve. Ensuring idempotency when the structure of the data or the </w:t>
-      </w:r>
-      <w:proofErr w:type="spellStart"/>
-      <w:r>
-        <w:t>behavior</w:t>
-      </w:r>
-      <w:proofErr w:type="spellEnd"/>
-      <w:r>
-        <w:t xml:space="preserve"> of the operation changes can be intricate.</w:t>
+        <w:t>Over time, the data structure or schema associated with a request might evolve. Ensuring idempotency when the structure of the data or the behavior of the operation changes can be intricate.</w:t>
       </w:r>
     </w:p>
     <w:p>
@@ -7705,7 +6208,7 @@
     </w:p>
     <w:p/>
     <w:p>
-      <w:hyperlink r:id="rId45" w:history="1">
+      <w:hyperlink r:id="rId46" w:history="1">
         <w:r>
           <w:rPr>
             <w:rStyle w:val="Hyperlink"/>
@@ -8152,15 +6655,7 @@
         </w:numPr>
       </w:pPr>
       <w:r>
-        <w:t>Headers: These are additional details that help the server understand the HTTP request, such as the format of the data (Content-Type: application/</w:t>
-      </w:r>
-      <w:proofErr w:type="spellStart"/>
-      <w:r>
-        <w:t>json</w:t>
-      </w:r>
-      <w:proofErr w:type="spellEnd"/>
-      <w:r>
-        <w:t>), authentication info (Authorization: Bearer &lt;token&gt;), or caching rules.</w:t>
+        <w:t>Headers: These are additional details that help the server understand the HTTP request, such as the format of the data (Content-Type: application/json), authentication info (Authorization: Bearer &lt;token&gt;), or caching rules.</w:t>
       </w:r>
     </w:p>
     <w:p>
@@ -8193,31 +6688,13 @@
       <w:r>
         <w:t>). It carries the actual data the client wants to send, usually in JSON format, for example, </w:t>
       </w:r>
-      <w:proofErr w:type="gramStart"/>
-      <w:r>
-        <w:rPr>
-          <w:b/>
-          <w:bCs/>
-        </w:rPr>
-        <w:t>{ "</w:t>
-      </w:r>
-      <w:proofErr w:type="gramEnd"/>
-      <w:r>
-        <w:rPr>
-          <w:b/>
-          <w:bCs/>
-        </w:rPr>
-        <w:t>name": "Alice</w:t>
-      </w:r>
-      <w:proofErr w:type="gramStart"/>
-      <w:r>
-        <w:rPr>
-          <w:b/>
-          <w:bCs/>
-        </w:rPr>
-        <w:t>" }</w:t>
-      </w:r>
-      <w:proofErr w:type="gramEnd"/>
+      <w:r>
+        <w:rPr>
+          <w:b/>
+          <w:bCs/>
+        </w:rPr>
+        <w:t>{ "name": "Alice" }</w:t>
+      </w:r>
       <w:r>
         <w:t>.</w:t>
       </w:r>
@@ -8292,31 +6769,13 @@
       <w:r>
         <w:t>The final part is the response body, which holds the actual dynamic data being returned, commonly in JSON format. For instance, when retrieving user information, the body might return </w:t>
       </w:r>
-      <w:proofErr w:type="gramStart"/>
-      <w:r>
-        <w:rPr>
-          <w:b/>
-          <w:bCs/>
-        </w:rPr>
-        <w:t>{ "</w:t>
-      </w:r>
-      <w:proofErr w:type="gramEnd"/>
-      <w:r>
-        <w:rPr>
-          <w:b/>
-          <w:bCs/>
-        </w:rPr>
-        <w:t>id": 1, "name": "Alice</w:t>
-      </w:r>
-      <w:proofErr w:type="gramStart"/>
-      <w:r>
-        <w:rPr>
-          <w:b/>
-          <w:bCs/>
-        </w:rPr>
-        <w:t>" }</w:t>
-      </w:r>
-      <w:proofErr w:type="gramEnd"/>
+      <w:r>
+        <w:rPr>
+          <w:b/>
+          <w:bCs/>
+        </w:rPr>
+        <w:t>{ "id": 1, "name": "Alice" }</w:t>
+      </w:r>
       <w:r>
         <w:t>.</w:t>
       </w:r>
@@ -8345,23 +6804,7 @@
           <w:b/>
           <w:bCs/>
         </w:rPr>
-        <w:t>/</w:t>
-      </w:r>
-      <w:proofErr w:type="spellStart"/>
-      <w:r>
-        <w:rPr>
-          <w:b/>
-          <w:bCs/>
-        </w:rPr>
-        <w:t>api</w:t>
-      </w:r>
-      <w:proofErr w:type="spellEnd"/>
-      <w:r>
-        <w:rPr>
-          <w:b/>
-          <w:bCs/>
-        </w:rPr>
-        <w:t>/orders/45</w:t>
+        <w:t>/api/orders/45</w:t>
       </w:r>
       <w:r>
         <w:t> might point to order </w:t>
@@ -8421,33 +6864,8 @@
           <w:b/>
           <w:bCs/>
         </w:rPr>
-        <w:t>/</w:t>
-      </w:r>
-      <w:proofErr w:type="spellStart"/>
-      <w:r>
-        <w:rPr>
-          <w:b/>
-          <w:bCs/>
-        </w:rPr>
-        <w:t>users?age</w:t>
-      </w:r>
-      <w:proofErr w:type="spellEnd"/>
-      <w:r>
-        <w:rPr>
-          <w:b/>
-          <w:bCs/>
-        </w:rPr>
-        <w:t>=30&amp;sort=</w:t>
-      </w:r>
-      <w:proofErr w:type="spellStart"/>
-      <w:r>
-        <w:rPr>
-          <w:b/>
-          <w:bCs/>
-        </w:rPr>
-        <w:t>asc</w:t>
-      </w:r>
-      <w:proofErr w:type="spellEnd"/>
+        <w:t>/users?age=30&amp;sort=asc</w:t>
+      </w:r>
       <w:r>
         <w:t>.</w:t>
       </w:r>
@@ -8846,15 +7264,7 @@
         <w:t>204 No Content</w:t>
       </w:r>
       <w:r>
-        <w:t xml:space="preserve"> if </w:t>
-      </w:r>
-      <w:proofErr w:type="spellStart"/>
-      <w:r>
-        <w:t>no body</w:t>
-      </w:r>
-      <w:proofErr w:type="spellEnd"/>
-      <w:r>
-        <w:t xml:space="preserve"> is returned. Both codes indicate success, but </w:t>
+        <w:t> if no body is returned. Both codes indicate success, but </w:t>
       </w:r>
       <w:r>
         <w:rPr>
@@ -9036,8 +7446,6 @@
       <w:r>
         <w:t>In HTTP basic authentication, the client sends credentials in the Authorization header as a Base64-encoded string in the format </w:t>
       </w:r>
-      <w:proofErr w:type="spellStart"/>
-      <w:proofErr w:type="gramStart"/>
       <w:r>
         <w:rPr>
           <w:b/>
@@ -9045,8 +7453,6 @@
         </w:rPr>
         <w:t>username:password</w:t>
       </w:r>
-      <w:proofErr w:type="spellEnd"/>
-      <w:proofErr w:type="gramEnd"/>
       <w:r>
         <w:t>. The server decodes and validates them. Since credentials are easily decodable, Basic Auth should always be used over HTTPS to ensure they are transmitted securely.</w:t>
       </w:r>
@@ -9248,15 +7654,7 @@
     </w:p>
     <w:p>
       <w:r>
-        <w:t xml:space="preserve">Sometimes the server may send executable code (like JavaScript) for the client to run. This is optional and allows for flexible client </w:t>
-      </w:r>
-      <w:proofErr w:type="spellStart"/>
-      <w:r>
-        <w:t>behavior</w:t>
-      </w:r>
-      <w:proofErr w:type="spellEnd"/>
-      <w:r>
-        <w:t>, but it isn’t common in traditional REST APIs.</w:t>
+        <w:t>Sometimes the server may send executable code (like JavaScript) for the client to run. This is optional and allows for flexible client behavior, but it isn’t common in traditional REST APIs.</w:t>
       </w:r>
     </w:p>
     <w:p>
@@ -9295,23 +7693,7 @@
           <w:b/>
           <w:bCs/>
         </w:rPr>
-        <w:t>/</w:t>
-      </w:r>
-      <w:proofErr w:type="spellStart"/>
-      <w:r>
-        <w:rPr>
-          <w:b/>
-          <w:bCs/>
-        </w:rPr>
-        <w:t>api</w:t>
-      </w:r>
-      <w:proofErr w:type="spellEnd"/>
-      <w:r>
-        <w:rPr>
-          <w:b/>
-          <w:bCs/>
-        </w:rPr>
-        <w:t>/v1/users</w:t>
+        <w:t>/api/v1/users</w:t>
       </w:r>
       <w:r>
         <w:t>. This is simple and widely used.</w:t>
@@ -9332,23 +7714,7 @@
           <w:b/>
           <w:bCs/>
         </w:rPr>
-        <w:t xml:space="preserve">Accept: </w:t>
-      </w:r>
-      <w:proofErr w:type="gramStart"/>
-      <w:r>
-        <w:rPr>
-          <w:b/>
-          <w:bCs/>
-        </w:rPr>
-        <w:t>application/vnd.myapp.v</w:t>
-      </w:r>
-      <w:proofErr w:type="gramEnd"/>
-      <w:r>
-        <w:rPr>
-          <w:b/>
-          <w:bCs/>
-        </w:rPr>
-        <w:t>2+json</w:t>
+        <w:t>Accept: application/vnd.myapp.v2+json</w:t>
       </w:r>
       <w:r>
         <w:t>. This keeps the URI clean but requires more client configuration.</w:t>
@@ -9369,23 +7735,7 @@
           <w:b/>
           <w:bCs/>
         </w:rPr>
-        <w:t>/</w:t>
-      </w:r>
-      <w:proofErr w:type="spellStart"/>
-      <w:r>
-        <w:rPr>
-          <w:b/>
-          <w:bCs/>
-        </w:rPr>
-        <w:t>users?version</w:t>
-      </w:r>
-      <w:proofErr w:type="spellEnd"/>
-      <w:r>
-        <w:rPr>
-          <w:b/>
-          <w:bCs/>
-        </w:rPr>
-        <w:t>=2</w:t>
+        <w:t>/users?version=2</w:t>
       </w:r>
       <w:r>
         <w:t>. This is less common but sometimes used for quick testing.</w:t>
@@ -9477,15 +7827,7 @@
     </w:p>
     <w:p>
       <w:r>
-        <w:t xml:space="preserve">For example, if </w:t>
-      </w:r>
-      <w:proofErr w:type="spellStart"/>
-      <w:r>
-        <w:t>your</w:t>
-      </w:r>
-      <w:proofErr w:type="spellEnd"/>
-      <w:r>
-        <w:t> </w:t>
+        <w:t>For example, if your </w:t>
       </w:r>
       <w:r>
         <w:rPr>
@@ -9495,15 +7837,7 @@
         <w:t>/users</w:t>
       </w:r>
       <w:r>
-        <w:t xml:space="preserve"> API adds a new </w:t>
-      </w:r>
-      <w:proofErr w:type="spellStart"/>
-      <w:r>
-        <w:t>phoneNumber</w:t>
-      </w:r>
-      <w:proofErr w:type="spellEnd"/>
-      <w:r>
-        <w:t xml:space="preserve"> field, don’t remove existing email or name fields. Just add the new field in the response so older clients can ignore it.</w:t>
+        <w:t> API adds a new phoneNumber field, don’t remove existing email or name fields. Just add the new field in the response so older clients can ignore it.</w:t>
       </w:r>
     </w:p>
     <w:p>
@@ -9523,15 +7857,7 @@
     </w:p>
     <w:p>
       <w:r>
-        <w:t xml:space="preserve">HATEOAS stands for Hypermedia as the Engine of Application State and is part of the uniform interface constraint in REST architecture. It is one of the </w:t>
-      </w:r>
-      <w:proofErr w:type="gramStart"/>
-      <w:r>
-        <w:t>key</w:t>
-      </w:r>
-      <w:proofErr w:type="gramEnd"/>
-      <w:r>
-        <w:t>, yet often overlooked, constraints of the REST architecture. In simple terms, it means that a REST server should provide not only the requested resource but also hyperlinks (or hypermedia controls) in the HTTP response that guide the client about possible next actions.</w:t>
+        <w:t>HATEOAS stands for Hypermedia as the Engine of Application State and is part of the uniform interface constraint in REST architecture. It is one of the key, yet often overlooked, constraints of the REST architecture. In simple terms, it means that a REST server should provide not only the requested resource but also hyperlinks (or hypermedia controls) in the HTTP response that guide the client about possible next actions.</w:t>
       </w:r>
     </w:p>
     <w:p>
@@ -9954,23 +8280,7 @@
           <w:b/>
           <w:bCs/>
         </w:rPr>
-        <w:t>Page &amp; limit: /</w:t>
-      </w:r>
-      <w:proofErr w:type="spellStart"/>
-      <w:r>
-        <w:rPr>
-          <w:b/>
-          <w:bCs/>
-        </w:rPr>
-        <w:t>users?page</w:t>
-      </w:r>
-      <w:proofErr w:type="spellEnd"/>
-      <w:r>
-        <w:rPr>
-          <w:b/>
-          <w:bCs/>
-        </w:rPr>
-        <w:t>=2&amp;limit=20</w:t>
+        <w:t>Page &amp; limit: /users?page=2&amp;limit=20</w:t>
       </w:r>
       <w:r>
         <w:t> → returns 20 users on page 2</w:t>
@@ -9988,23 +8298,7 @@
           <w:b/>
           <w:bCs/>
         </w:rPr>
-        <w:t>Offset &amp; limit: /</w:t>
-      </w:r>
-      <w:proofErr w:type="spellStart"/>
-      <w:r>
-        <w:rPr>
-          <w:b/>
-          <w:bCs/>
-        </w:rPr>
-        <w:t>users?offset</w:t>
-      </w:r>
-      <w:proofErr w:type="spellEnd"/>
-      <w:r>
-        <w:rPr>
-          <w:b/>
-          <w:bCs/>
-        </w:rPr>
-        <w:t>=40&amp;limit=20</w:t>
+        <w:t>Offset &amp; limit: /users?offset=40&amp;limit=20</w:t>
       </w:r>
       <w:r>
         <w:t> → skips 40 users, then returns the next 20</w:t>
@@ -10089,23 +8383,13 @@
       </w:r>
     </w:p>
     <w:p>
-      <w:proofErr w:type="spellStart"/>
       <w:r>
         <w:t>javascript</w:t>
       </w:r>
-      <w:proofErr w:type="spellEnd"/>
-    </w:p>
-    <w:p>
-      <w:r>
-        <w:t>Accept: application/</w:t>
-      </w:r>
-      <w:proofErr w:type="spellStart"/>
-      <w:r>
-        <w:t>json</w:t>
-      </w:r>
-      <w:proofErr w:type="spellEnd"/>
-      <w:r>
-        <w:t xml:space="preserve">: server responds in JSON. Accept: application/xml: server responds in XML. </w:t>
+    </w:p>
+    <w:p>
+      <w:r>
+        <w:t xml:space="preserve">Accept: application/json: server responds in JSON. Accept: application/xml: server responds in XML. </w:t>
       </w:r>
     </w:p>
     <w:p>
@@ -10125,39 +8409,7 @@
           <w:b/>
           <w:bCs/>
         </w:rPr>
-        <w:t xml:space="preserve">30. How does REST compare to </w:t>
-      </w:r>
-      <w:proofErr w:type="spellStart"/>
-      <w:r>
-        <w:rPr>
-          <w:b/>
-          <w:bCs/>
-        </w:rPr>
-        <w:t>GraphQL</w:t>
-      </w:r>
-      <w:proofErr w:type="spellEnd"/>
-      <w:r>
-        <w:rPr>
-          <w:b/>
-          <w:bCs/>
-        </w:rPr>
-        <w:t xml:space="preserve"> and </w:t>
-      </w:r>
-      <w:proofErr w:type="spellStart"/>
-      <w:r>
-        <w:rPr>
-          <w:b/>
-          <w:bCs/>
-        </w:rPr>
-        <w:t>gRPC</w:t>
-      </w:r>
-      <w:proofErr w:type="spellEnd"/>
-      <w:r>
-        <w:rPr>
-          <w:b/>
-          <w:bCs/>
-        </w:rPr>
-        <w:t>?</w:t>
+        <w:t>30. How does REST compare to GraphQL and gRPC?</w:t>
       </w:r>
     </w:p>
     <w:p>
@@ -10174,7 +8426,6 @@
       </w:r>
     </w:p>
     <w:p>
-      <w:proofErr w:type="spellStart"/>
       <w:r>
         <w:rPr>
           <w:b/>
@@ -10182,13 +8433,11 @@
         </w:rPr>
         <w:t>GraphQL</w:t>
       </w:r>
-      <w:proofErr w:type="spellEnd"/>
       <w:r>
         <w:t> gives clients the flexibility to request only the fields they need in a single query. This reduces round-trip time but requires more setup.</w:t>
       </w:r>
     </w:p>
     <w:p>
-      <w:proofErr w:type="spellStart"/>
       <w:r>
         <w:rPr>
           <w:b/>
@@ -10196,7 +8445,6 @@
         </w:rPr>
         <w:t>gRPC</w:t>
       </w:r>
-      <w:proofErr w:type="spellEnd"/>
       <w:r>
         <w:t> is a high-performance, binary protocol based on HTTP/2. It supports streaming and is great for microservices, but less human-readable than REST.</w:t>
       </w:r>
@@ -10301,15 +8549,7 @@
     </w:p>
     <w:p>
       <w:r>
-        <w:t xml:space="preserve">When building REST APIs, make them simple and reliable. Use clear and consistent paths (URIs) for your resources and match each HTTP method to the correct action, </w:t>
-      </w:r>
-      <w:proofErr w:type="spellStart"/>
-      <w:r>
-        <w:t>i.e</w:t>
-      </w:r>
-      <w:proofErr w:type="spellEnd"/>
-      <w:r>
-        <w:t>, (</w:t>
+        <w:t>When building REST APIs, make them simple and reliable. Use clear and consistent paths (URIs) for your resources and match each HTTP method to the correct action, i.e, (</w:t>
       </w:r>
       <w:r>
         <w:rPr>
@@ -10519,46 +8759,20 @@
     </w:p>
     <w:p>
       <w:r>
-        <w:t>In RESTful web services, the two most common data formats for request and response bodies are JSON (JavaScript Object Notation) and XML (</w:t>
-      </w:r>
-      <w:proofErr w:type="spellStart"/>
-      <w:r>
-        <w:t>eXtensible</w:t>
-      </w:r>
-      <w:proofErr w:type="spellEnd"/>
-      <w:r>
-        <w:t xml:space="preserve"> Markup Language). Both serve the same purpose, i.e., structuring data, but they differ in style and use cases.</w:t>
+        <w:t>In RESTful web services, the two most common data formats for request and response bodies are JSON (JavaScript Object Notation) and XML (eXtensible Markup Language). Both serve the same purpose, i.e., structuring data, but they differ in style and use cases.</w:t>
       </w:r>
     </w:p>
     <w:p>
       <w:r>
         <w:t>JSON is lightweight, less verbose, and very close to how data structures are represented in most programming languages, especially JavaScript. It uses key-value pairs, arrays, and objects, which makes it faster to parse and easier for developers to work with. Because of its simplicity and efficiency, JSON has become the default choice for most modern REST APIs. For example, </w:t>
       </w:r>
-      <w:proofErr w:type="gramStart"/>
-      <w:r>
-        <w:rPr>
-          <w:b/>
-          <w:bCs/>
-        </w:rPr>
-        <w:t>{ "</w:t>
-      </w:r>
-      <w:proofErr w:type="gramEnd"/>
-      <w:r>
-        <w:rPr>
-          <w:b/>
-          <w:bCs/>
-        </w:rPr>
-        <w:t>id": 1, "name": "Alice</w:t>
-      </w:r>
-      <w:proofErr w:type="gramStart"/>
-      <w:r>
-        <w:rPr>
-          <w:b/>
-          <w:bCs/>
-        </w:rPr>
-        <w:t>" }</w:t>
-      </w:r>
-      <w:proofErr w:type="gramEnd"/>
+      <w:r>
+        <w:rPr>
+          <w:b/>
+          <w:bCs/>
+        </w:rPr>
+        <w:t>{ "id": 1, "name": "Alice" }</w:t>
+      </w:r>
       <w:r>
         <w:t>.</w:t>
       </w:r>
@@ -10596,83 +8810,22 @@
           <w:bCs/>
         </w:rPr>
         <w:lastRenderedPageBreak/>
-        <w:t xml:space="preserve">37. What is the difference between Swagger and </w:t>
-      </w:r>
-      <w:proofErr w:type="spellStart"/>
-      <w:r>
-        <w:rPr>
-          <w:b/>
-          <w:bCs/>
-        </w:rPr>
-        <w:t>OpenAPI</w:t>
-      </w:r>
-      <w:proofErr w:type="spellEnd"/>
-      <w:r>
-        <w:rPr>
-          <w:b/>
-          <w:bCs/>
-        </w:rPr>
-        <w:t>?</w:t>
-      </w:r>
-    </w:p>
-    <w:p>
-      <w:r>
-        <w:t xml:space="preserve">The terms Swagger and </w:t>
-      </w:r>
-      <w:proofErr w:type="spellStart"/>
-      <w:r>
-        <w:t>OpenAPI</w:t>
-      </w:r>
-      <w:proofErr w:type="spellEnd"/>
-      <w:r>
-        <w:t xml:space="preserve"> are closely related. The key point is that </w:t>
-      </w:r>
-      <w:proofErr w:type="spellStart"/>
-      <w:r>
-        <w:t>OpenAPI</w:t>
-      </w:r>
-      <w:proofErr w:type="spellEnd"/>
-      <w:r>
-        <w:t xml:space="preserve"> is the specification, while Swagger is a set of tools that help you use that specification.</w:t>
-      </w:r>
-    </w:p>
-    <w:p>
-      <w:proofErr w:type="spellStart"/>
-      <w:r>
-        <w:t>OpenAPI</w:t>
-      </w:r>
-      <w:proofErr w:type="spellEnd"/>
-      <w:r>
-        <w:t xml:space="preserve"> is a standard way to describe REST APIs. It defines how you can document details such as available endpoints, request methods, query parameters, authentication types, and expected responses. For example, an </w:t>
-      </w:r>
-      <w:proofErr w:type="spellStart"/>
-      <w:r>
-        <w:t>OpenAPI</w:t>
-      </w:r>
-      <w:proofErr w:type="spellEnd"/>
-      <w:r>
-        <w:t xml:space="preserve"> document (usually written in YAML or JSON) acts like a blueprint of the API that both humans and machines can understand. This makes it easier to generate documentation, client SDKs, and tests automatically.</w:t>
-      </w:r>
-    </w:p>
-    <w:p>
-      <w:r>
-        <w:t xml:space="preserve">Swagger, on the other hand, started as both a specification and a toolset. Later, the specification part was donated to the Linux Foundation and renamed </w:t>
-      </w:r>
-      <w:proofErr w:type="spellStart"/>
-      <w:r>
-        <w:t>OpenAPI</w:t>
-      </w:r>
-      <w:proofErr w:type="spellEnd"/>
-      <w:r>
-        <w:t xml:space="preserve"> Specification (OAS). Since then, “Swagger” refers mainly to the tools that support </w:t>
-      </w:r>
-      <w:proofErr w:type="spellStart"/>
-      <w:r>
-        <w:t>OpenAPI</w:t>
-      </w:r>
-      <w:proofErr w:type="spellEnd"/>
-      <w:r>
-        <w:t>. These include:</w:t>
+        <w:t>37. What is the difference between Swagger and OpenAPI?</w:t>
+      </w:r>
+    </w:p>
+    <w:p>
+      <w:r>
+        <w:t>The terms Swagger and OpenAPI are closely related. The key point is that OpenAPI is the specification, while Swagger is a set of tools that help you use that specification.</w:t>
+      </w:r>
+    </w:p>
+    <w:p>
+      <w:r>
+        <w:t>OpenAPI is a standard way to describe REST APIs. It defines how you can document details such as available endpoints, request methods, query parameters, authentication types, and expected responses. For example, an OpenAPI document (usually written in YAML or JSON) acts like a blueprint of the API that both humans and machines can understand. This makes it easier to generate documentation, client SDKs, and tests automatically.</w:t>
+      </w:r>
+    </w:p>
+    <w:p>
+      <w:r>
+        <w:t>Swagger, on the other hand, started as both a specification and a toolset. Later, the specification part was donated to the Linux Foundation and renamed OpenAPI Specification (OAS). Since then, “Swagger” refers mainly to the tools that support OpenAPI. These include:</w:t>
       </w:r>
     </w:p>
     <w:p>
@@ -10723,32 +8876,15 @@
           <w:b/>
           <w:bCs/>
         </w:rPr>
-        <w:t xml:space="preserve">Swagger </w:t>
-      </w:r>
-      <w:proofErr w:type="spellStart"/>
-      <w:r>
-        <w:rPr>
-          <w:b/>
-          <w:bCs/>
-        </w:rPr>
-        <w:t>Codegen</w:t>
-      </w:r>
-      <w:proofErr w:type="spellEnd"/>
+        <w:t>Swagger Codegen</w:t>
+      </w:r>
       <w:r>
         <w:t> to generate server stubs or client SDKs.</w:t>
       </w:r>
     </w:p>
     <w:p>
       <w:r>
-        <w:t xml:space="preserve">In short, </w:t>
-      </w:r>
-      <w:proofErr w:type="spellStart"/>
-      <w:r>
-        <w:t>OpenAPI</w:t>
-      </w:r>
-      <w:proofErr w:type="spellEnd"/>
-      <w:r>
-        <w:t xml:space="preserve"> is the specification (the rules and format), and Swagger is the toolset that implements and works with that specification.</w:t>
+        <w:t>In short, OpenAPI is the specification (the rules and format), and Swagger is the toolset that implements and works with that specification.</w:t>
       </w:r>
     </w:p>
     <w:p>
@@ -10780,7 +8916,7 @@
       <w:r>
         <w:t>For further learning, explore the </w:t>
       </w:r>
-      <w:hyperlink r:id="rId46" w:tgtFrame="_blank" w:history="1">
+      <w:hyperlink r:id="rId47" w:tgtFrame="_blank" w:history="1">
         <w:r>
           <w:rPr>
             <w:rStyle w:val="Hyperlink"/>
@@ -10791,7 +8927,7 @@
       <w:r>
         <w:t> to expand your understanding of broader API design principles and practices beyond REST. Go through our helpful resources and check out other </w:t>
       </w:r>
-      <w:hyperlink r:id="rId47" w:tgtFrame="_blank" w:history="1">
+      <w:hyperlink r:id="rId48" w:tgtFrame="_blank" w:history="1">
         <w:r>
           <w:rPr>
             <w:rStyle w:val="Hyperlink"/>
@@ -14962,6 +13098,7 @@
   <w:style w:type="character" w:default="1" w:styleId="DefaultParagraphFont">
     <w:name w:val="Default Paragraph Font"/>
     <w:uiPriority w:val="1"/>
+    <w:semiHidden/>
     <w:unhideWhenUsed/>
   </w:style>
   <w:style w:type="table" w:default="1" w:styleId="TableNormal">

</xml_diff>